<commit_message>
upload the picture of thermosister setup
</commit_message>
<xml_diff>
--- a/MATLAB Coursework 2  Word Template.docx
+++ b/MATLAB Coursework 2  Word Template.docx
@@ -8,7 +8,7 @@
     <w:p/>
     <w:p>
       <w:pPr>
-        <w:pStyle w:val="Title"/>
+        <w:pStyle w:val="a8"/>
       </w:pPr>
       <w:r>
         <w:t>AERO1005 MATLAB Coursework 2</w:t>
@@ -20,6 +20,7 @@
         <w:rPr>
           <w:b/>
           <w:bCs/>
+          <w:lang w:val="en-US" w:eastAsia="zh-CN"/>
         </w:rPr>
       </w:pPr>
       <w:r>
@@ -27,7 +28,15 @@
           <w:b/>
           <w:bCs/>
         </w:rPr>
-        <w:t>Author: Add your name</w:t>
+        <w:t xml:space="preserve">Author: </w:t>
+      </w:r>
+      <w:r>
+        <w:rPr>
+          <w:b/>
+          <w:bCs/>
+          <w:lang w:val="en-US" w:eastAsia="zh-CN"/>
+        </w:rPr>
+        <w:t>Ruixuan ZOU</w:t>
       </w:r>
     </w:p>
     <w:p>
@@ -42,7 +51,14 @@
           <w:b/>
           <w:bCs/>
         </w:rPr>
-        <w:t>Student ID: Put your ID number here</w:t>
+        <w:t xml:space="preserve">Student ID: </w:t>
+      </w:r>
+      <w:r>
+        <w:rPr>
+          <w:b/>
+          <w:bCs/>
+        </w:rPr>
+        <w:t>20719241</w:t>
       </w:r>
     </w:p>
     <w:p>
@@ -107,12 +123,114 @@
           <w:highlight w:val="cyan"/>
         </w:rPr>
       </w:pPr>
+      <w:r>
+        <w:rPr>
+          <w:color w:val="000000" w:themeColor="text1"/>
+          <w:highlight w:val="cyan"/>
+        </w:rPr>
+        <w:t xml:space="preserve">TASK 1: </w:t>
+      </w:r>
+      <w:r>
+        <w:rPr>
+          <w:color w:val="000000" w:themeColor="text1"/>
+          <w:highlight w:val="cyan"/>
+        </w:rPr>
+        <w:t>READ TEMPERATURE DATA, PLOT, AND WRITE TO A LOG FILE</w:t>
+      </w:r>
+    </w:p>
+    <w:p>
+      <w:pPr>
+        <w:pStyle w:val="a0"/>
+        <w:numPr>
+          <w:ilvl w:val="0"/>
+          <w:numId w:val="5"/>
+        </w:numPr>
+        <w:spacing w:line="259" w:lineRule="auto"/>
+        <w:jc w:val="both"/>
+        <w:rPr>
+          <w:color w:val="000000" w:themeColor="text1"/>
+          <w:highlight w:val="cyan"/>
+        </w:rPr>
+      </w:pPr>
+      <w:r>
+        <w:rPr>
+          <w:color w:val="000000" w:themeColor="text1"/>
+          <w:highlight w:val="cyan"/>
+        </w:rPr>
+        <w:t xml:space="preserve">Set up of </w:t>
+      </w:r>
+      <w:r>
+        <w:rPr>
+          <w:color w:val="000000" w:themeColor="text1"/>
+          <w:highlight w:val="cyan"/>
+        </w:rPr>
+        <w:t>thermistor</w:t>
+      </w:r>
+    </w:p>
+    <w:p>
+      <w:pPr>
+        <w:pStyle w:val="a0"/>
+        <w:spacing w:line="259" w:lineRule="auto"/>
+        <w:ind w:left="360"/>
+        <w:jc w:val="both"/>
+        <w:rPr>
+          <w:color w:val="000000" w:themeColor="text1"/>
+          <w:highlight w:val="cyan"/>
+        </w:rPr>
+      </w:pPr>
+      <w:r>
+        <w:rPr>
+          <w:noProof/>
+          <w:color w:val="000000" w:themeColor="text1"/>
+        </w:rPr>
+        <w:drawing>
+          <wp:inline distT="0" distB="0" distL="0" distR="0" wp14:anchorId="693FD5FF" wp14:editId="6A7CA157">
+            <wp:extent cx="5410200" cy="3043163"/>
+            <wp:effectExtent l="0" t="0" r="0" b="5080"/>
+            <wp:docPr id="1654539816" name="图片 3"/>
+            <wp:cNvGraphicFramePr>
+              <a:graphicFrameLocks xmlns:a="http://schemas.openxmlformats.org/drawingml/2006/main" noChangeAspect="1"/>
+            </wp:cNvGraphicFramePr>
+            <a:graphic xmlns:a="http://schemas.openxmlformats.org/drawingml/2006/main">
+              <a:graphicData uri="http://schemas.openxmlformats.org/drawingml/2006/picture">
+                <pic:pic xmlns:pic="http://schemas.openxmlformats.org/drawingml/2006/picture">
+                  <pic:nvPicPr>
+                    <pic:cNvPr id="1654539816" name="图片 1654539816"/>
+                    <pic:cNvPicPr/>
+                  </pic:nvPicPr>
+                  <pic:blipFill>
+                    <a:blip r:embed="rId8" cstate="print">
+                      <a:extLst>
+                        <a:ext uri="{28A0092B-C50C-407E-A947-70E740481C1C}">
+                          <a14:useLocalDpi xmlns:a14="http://schemas.microsoft.com/office/drawing/2010/main" val="0"/>
+                        </a:ext>
+                      </a:extLst>
+                    </a:blip>
+                    <a:stretch>
+                      <a:fillRect/>
+                    </a:stretch>
+                  </pic:blipFill>
+                  <pic:spPr>
+                    <a:xfrm>
+                      <a:off x="0" y="0"/>
+                      <a:ext cx="5429991" cy="3054295"/>
+                    </a:xfrm>
+                    <a:prstGeom prst="rect">
+                      <a:avLst/>
+                    </a:prstGeom>
+                  </pic:spPr>
+                </pic:pic>
+              </a:graphicData>
+            </a:graphic>
+          </wp:inline>
+        </w:drawing>
+      </w:r>
     </w:p>
     <w:sectPr>
-      <w:headerReference w:type="default" r:id="rId8"/>
-      <w:footerReference w:type="default" r:id="rId9"/>
-      <w:headerReference w:type="first" r:id="rId10"/>
-      <w:footerReference w:type="first" r:id="rId11"/>
+      <w:headerReference w:type="default" r:id="rId9"/>
+      <w:footerReference w:type="default" r:id="rId10"/>
+      <w:headerReference w:type="first" r:id="rId11"/>
+      <w:footerReference w:type="first" r:id="rId12"/>
       <w:pgSz w:w="11906" w:h="16838"/>
       <w:pgMar w:top="1440" w:right="1440" w:bottom="1440" w:left="1440" w:header="850" w:footer="708" w:gutter="0"/>
       <w:cols w:space="708"/>
@@ -167,7 +285,7 @@
     <w:sdtContent>
       <w:p>
         <w:pPr>
-          <w:pStyle w:val="Footer"/>
+          <w:pStyle w:val="a6"/>
           <w:jc w:val="right"/>
         </w:pPr>
         <w:r>
@@ -226,7 +344,7 @@
             </mc:Choice>
             <mc:Fallback>
               <w:pict>
-                <v:line w14:anchorId="68CAF598" id="Straight Connector 4" o:spid="_x0000_s1026" style="position:absolute;z-index:251658243;visibility:visible;mso-wrap-style:square;mso-wrap-distance-left:9pt;mso-wrap-distance-top:0;mso-wrap-distance-right:9pt;mso-wrap-distance-bottom:0;mso-position-horizontal:absolute;mso-position-horizontal-relative:text;mso-position-vertical:absolute;mso-position-vertical-relative:text" from="-.75pt,-10.2pt" to="454.5pt,-10.2pt" o:gfxdata="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" strokecolor="#4472c4 [3204]" strokeweight=".5pt">
+                <v:line w14:anchorId="6545F60D" id="Straight Connector 4" o:spid="_x0000_s1026" style="position:absolute;z-index:251658243;visibility:visible;mso-wrap-style:square;mso-wrap-distance-left:9pt;mso-wrap-distance-top:0;mso-wrap-distance-right:9pt;mso-wrap-distance-bottom:0;mso-position-horizontal:absolute;mso-position-horizontal-relative:text;mso-position-vertical:absolute;mso-position-vertical-relative:text" from="-.75pt,-10.2pt" to="454.5pt,-10.2pt" o:gfxdata="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" strokecolor="#4472c4 [3204]" strokeweight=".5pt">
                   <v:stroke joinstyle="miter"/>
                 </v:line>
               </w:pict>
@@ -259,7 +377,7 @@
   </w:sdt>
   <w:p>
     <w:pPr>
-      <w:pStyle w:val="Footer"/>
+      <w:pStyle w:val="a6"/>
       <w:rPr>
         <w:i/>
         <w:iCs/>
@@ -304,13 +422,13 @@
 <w:ftr xmlns:wpc="http://schemas.microsoft.com/office/word/2010/wordprocessingCanvas" xmlns:cx="http://schemas.microsoft.com/office/drawing/2014/chartex" xmlns:cx1="http://schemas.microsoft.com/office/drawing/2015/9/8/chartex" xmlns:cx2="http://schemas.microsoft.com/office/drawing/2015/10/21/chartex" xmlns:cx3="http://schemas.microsoft.com/office/drawing/2016/5/9/chartex" xmlns:cx4="http://schemas.microsoft.com/office/drawing/2016/5/10/chartex" xmlns:cx5="http://schemas.microsoft.com/office/drawing/2016/5/11/chartex" xmlns:cx6="http://schemas.microsoft.com/office/drawing/2016/5/12/chartex" xmlns:cx7="http://schemas.microsoft.com/office/drawing/2016/5/13/chartex" xmlns:cx8="http://schemas.microsoft.com/office/drawing/2016/5/14/chartex" xmlns:mc="http://schemas.openxmlformats.org/markup-compatibility/2006" xmlns:aink="http://schemas.microsoft.com/office/drawing/2016/ink" xmlns:am3d="http://schemas.microsoft.com/office/drawing/2017/model3d" xmlns:o="urn:schemas-microsoft-com:office:office" xmlns:oel="http://schemas.microsoft.com/office/2019/extlst" xmlns:r="http://schemas.openxmlformats.org/officeDocument/2006/relationships" xmlns:m="http://schemas.openxmlformats.org/officeDocument/2006/math" xmlns:v="urn:schemas-microsoft-com:vml" xmlns:wp14="http://schemas.microsoft.com/office/word/2010/wordprocessingDrawing" xmlns:wp="http://schemas.openxmlformats.org/drawingml/2006/wordprocessingDrawing" xmlns:w10="urn:schemas-microsoft-com:office:word" xmlns:w="http://schemas.openxmlformats.org/wordprocessingml/2006/main" xmlns:w14="http://schemas.microsoft.com/office/word/2010/wordml" xmlns:w15="http://schemas.microsoft.com/office/word/2012/wordml" xmlns:w16cex="http://schemas.microsoft.com/office/word/2018/wordml/cex" xmlns:w16cid="http://schemas.microsoft.com/office/word/2016/wordml/cid" xmlns:w16="http://schemas.microsoft.com/office/word/2018/wordml" xmlns:w16du="http://schemas.microsoft.com/office/word/2023/wordml/word16du" xmlns:w16sdtdh="http://schemas.microsoft.com/office/word/2020/wordml/sdtdatahash" xmlns:w16sdtfl="http://schemas.microsoft.com/office/word/2024/wordml/sdtformatlock" xmlns:w16se="http://schemas.microsoft.com/office/word/2015/wordml/symex" xmlns:wpg="http://schemas.microsoft.com/office/word/2010/wordprocessingGroup" xmlns:wpi="http://schemas.microsoft.com/office/word/2010/wordprocessingInk" xmlns:wne="http://schemas.microsoft.com/office/word/2006/wordml" xmlns:wps="http://schemas.microsoft.com/office/word/2010/wordprocessingShape" mc:Ignorable="w14 w15 w16se w16cid w16 w16cex w16sdtdh w16sdtfl w16du wp14">
   <w:p>
     <w:pPr>
-      <w:pStyle w:val="Footer"/>
+      <w:pStyle w:val="a6"/>
       <w:jc w:val="right"/>
     </w:pPr>
   </w:p>
   <w:p>
     <w:pPr>
-      <w:pStyle w:val="Footer"/>
+      <w:pStyle w:val="a6"/>
     </w:pPr>
   </w:p>
 </w:ftr>
@@ -346,7 +464,7 @@
 <w:hdr xmlns:wpc="http://schemas.microsoft.com/office/word/2010/wordprocessingCanvas" xmlns:cx="http://schemas.microsoft.com/office/drawing/2014/chartex" xmlns:cx1="http://schemas.microsoft.com/office/drawing/2015/9/8/chartex" xmlns:cx2="http://schemas.microsoft.com/office/drawing/2015/10/21/chartex" xmlns:cx3="http://schemas.microsoft.com/office/drawing/2016/5/9/chartex" xmlns:cx4="http://schemas.microsoft.com/office/drawing/2016/5/10/chartex" xmlns:cx5="http://schemas.microsoft.com/office/drawing/2016/5/11/chartex" xmlns:cx6="http://schemas.microsoft.com/office/drawing/2016/5/12/chartex" xmlns:cx7="http://schemas.microsoft.com/office/drawing/2016/5/13/chartex" xmlns:cx8="http://schemas.microsoft.com/office/drawing/2016/5/14/chartex" xmlns:mc="http://schemas.openxmlformats.org/markup-compatibility/2006" xmlns:aink="http://schemas.microsoft.com/office/drawing/2016/ink" xmlns:am3d="http://schemas.microsoft.com/office/drawing/2017/model3d" xmlns:o="urn:schemas-microsoft-com:office:office" xmlns:oel="http://schemas.microsoft.com/office/2019/extlst" xmlns:r="http://schemas.openxmlformats.org/officeDocument/2006/relationships" xmlns:m="http://schemas.openxmlformats.org/officeDocument/2006/math" xmlns:v="urn:schemas-microsoft-com:vml" xmlns:wp14="http://schemas.microsoft.com/office/word/2010/wordprocessingDrawing" xmlns:wp="http://schemas.openxmlformats.org/drawingml/2006/wordprocessingDrawing" xmlns:w10="urn:schemas-microsoft-com:office:word" xmlns:w="http://schemas.openxmlformats.org/wordprocessingml/2006/main" xmlns:w14="http://schemas.microsoft.com/office/word/2010/wordml" xmlns:w15="http://schemas.microsoft.com/office/word/2012/wordml" xmlns:w16cex="http://schemas.microsoft.com/office/word/2018/wordml/cex" xmlns:w16cid="http://schemas.microsoft.com/office/word/2016/wordml/cid" xmlns:w16="http://schemas.microsoft.com/office/word/2018/wordml" xmlns:w16du="http://schemas.microsoft.com/office/word/2023/wordml/word16du" xmlns:w16sdtdh="http://schemas.microsoft.com/office/word/2020/wordml/sdtdatahash" xmlns:w16sdtfl="http://schemas.microsoft.com/office/word/2024/wordml/sdtformatlock" xmlns:w16se="http://schemas.microsoft.com/office/word/2015/wordml/symex" xmlns:wpg="http://schemas.microsoft.com/office/word/2010/wordprocessingGroup" xmlns:wpi="http://schemas.microsoft.com/office/word/2010/wordprocessingInk" xmlns:wne="http://schemas.microsoft.com/office/word/2006/wordml" xmlns:wps="http://schemas.microsoft.com/office/word/2010/wordprocessingShape" mc:Ignorable="w14 w15 w16se w16cid w16 w16cex w16sdtdh w16sdtfl w16du wp14">
   <w:p>
     <w:pPr>
-      <w:pStyle w:val="Header"/>
+      <w:pStyle w:val="a4"/>
       <w:rPr>
         <w:i/>
         <w:iCs/>
@@ -373,7 +491,7 @@
 <w:hdr xmlns:wpc="http://schemas.microsoft.com/office/word/2010/wordprocessingCanvas" xmlns:cx="http://schemas.microsoft.com/office/drawing/2014/chartex" xmlns:cx1="http://schemas.microsoft.com/office/drawing/2015/9/8/chartex" xmlns:cx2="http://schemas.microsoft.com/office/drawing/2015/10/21/chartex" xmlns:cx3="http://schemas.microsoft.com/office/drawing/2016/5/9/chartex" xmlns:cx4="http://schemas.microsoft.com/office/drawing/2016/5/10/chartex" xmlns:cx5="http://schemas.microsoft.com/office/drawing/2016/5/11/chartex" xmlns:cx6="http://schemas.microsoft.com/office/drawing/2016/5/12/chartex" xmlns:cx7="http://schemas.microsoft.com/office/drawing/2016/5/13/chartex" xmlns:cx8="http://schemas.microsoft.com/office/drawing/2016/5/14/chartex" xmlns:mc="http://schemas.openxmlformats.org/markup-compatibility/2006" xmlns:aink="http://schemas.microsoft.com/office/drawing/2016/ink" xmlns:am3d="http://schemas.microsoft.com/office/drawing/2017/model3d" xmlns:o="urn:schemas-microsoft-com:office:office" xmlns:oel="http://schemas.microsoft.com/office/2019/extlst" xmlns:r="http://schemas.openxmlformats.org/officeDocument/2006/relationships" xmlns:m="http://schemas.openxmlformats.org/officeDocument/2006/math" xmlns:v="urn:schemas-microsoft-com:vml" xmlns:wp14="http://schemas.microsoft.com/office/word/2010/wordprocessingDrawing" xmlns:wp="http://schemas.openxmlformats.org/drawingml/2006/wordprocessingDrawing" xmlns:w10="urn:schemas-microsoft-com:office:word" xmlns:w="http://schemas.openxmlformats.org/wordprocessingml/2006/main" xmlns:w14="http://schemas.microsoft.com/office/word/2010/wordml" xmlns:w15="http://schemas.microsoft.com/office/word/2012/wordml" xmlns:w16cex="http://schemas.microsoft.com/office/word/2018/wordml/cex" xmlns:w16cid="http://schemas.microsoft.com/office/word/2016/wordml/cid" xmlns:w16="http://schemas.microsoft.com/office/word/2018/wordml" xmlns:w16du="http://schemas.microsoft.com/office/word/2023/wordml/word16du" xmlns:w16sdtdh="http://schemas.microsoft.com/office/word/2020/wordml/sdtdatahash" xmlns:w16sdtfl="http://schemas.microsoft.com/office/word/2024/wordml/sdtformatlock" xmlns:w16se="http://schemas.microsoft.com/office/word/2015/wordml/symex" xmlns:wpg="http://schemas.microsoft.com/office/word/2010/wordprocessingGroup" xmlns:wpi="http://schemas.microsoft.com/office/word/2010/wordprocessingInk" xmlns:wne="http://schemas.microsoft.com/office/word/2006/wordml" xmlns:wps="http://schemas.microsoft.com/office/word/2010/wordprocessingShape" mc:Ignorable="w14 w15 w16se w16cid w16 w16cex w16sdtdh w16sdtfl w16du wp14">
   <w:p>
     <w:pPr>
-      <w:pStyle w:val="Header"/>
+      <w:pStyle w:val="a4"/>
     </w:pPr>
     <w:r>
       <w:rPr>
@@ -648,7 +766,7 @@
     <w:lvl w:ilvl="0">
       <w:start w:val="1"/>
       <w:numFmt w:val="decimal"/>
-      <w:pStyle w:val="Heading1"/>
+      <w:pStyle w:val="1"/>
       <w:lvlText w:val="%1."/>
       <w:lvlJc w:val="left"/>
       <w:pPr>
@@ -658,7 +776,7 @@
     <w:lvl w:ilvl="1">
       <w:start w:val="1"/>
       <w:numFmt w:val="decimal"/>
-      <w:pStyle w:val="Heading2"/>
+      <w:pStyle w:val="2"/>
       <w:lvlText w:val="%1.%2."/>
       <w:lvlJc w:val="left"/>
       <w:pPr>
@@ -953,6 +1071,95 @@
       <w:rPr>
         <w:rFonts w:ascii="Wingdings" w:hAnsi="Wingdings" w:hint="default"/>
       </w:rPr>
+    </w:lvl>
+  </w:abstractNum>
+  <w:abstractNum w:abstractNumId="4" w15:restartNumberingAfterBreak="0">
+    <w:nsid w:val="596A136B"/>
+    <w:multiLevelType w:val="hybridMultilevel"/>
+    <w:tmpl w:val="E8A47C52"/>
+    <w:lvl w:ilvl="0" w:tplc="076E6570">
+      <w:start w:val="1"/>
+      <w:numFmt w:val="lowerLetter"/>
+      <w:lvlText w:val="%1)"/>
+      <w:lvlJc w:val="left"/>
+      <w:pPr>
+        <w:ind w:left="360" w:hanging="360"/>
+      </w:pPr>
+      <w:rPr>
+        <w:rFonts w:hint="default"/>
+      </w:rPr>
+    </w:lvl>
+    <w:lvl w:ilvl="1" w:tplc="04090019" w:tentative="1">
+      <w:start w:val="1"/>
+      <w:numFmt w:val="lowerLetter"/>
+      <w:lvlText w:val="%2)"/>
+      <w:lvlJc w:val="left"/>
+      <w:pPr>
+        <w:ind w:left="880" w:hanging="440"/>
+      </w:pPr>
+    </w:lvl>
+    <w:lvl w:ilvl="2" w:tplc="0409001B" w:tentative="1">
+      <w:start w:val="1"/>
+      <w:numFmt w:val="lowerRoman"/>
+      <w:lvlText w:val="%3."/>
+      <w:lvlJc w:val="right"/>
+      <w:pPr>
+        <w:ind w:left="1320" w:hanging="440"/>
+      </w:pPr>
+    </w:lvl>
+    <w:lvl w:ilvl="3" w:tplc="0409000F" w:tentative="1">
+      <w:start w:val="1"/>
+      <w:numFmt w:val="decimal"/>
+      <w:lvlText w:val="%4."/>
+      <w:lvlJc w:val="left"/>
+      <w:pPr>
+        <w:ind w:left="1760" w:hanging="440"/>
+      </w:pPr>
+    </w:lvl>
+    <w:lvl w:ilvl="4" w:tplc="04090019" w:tentative="1">
+      <w:start w:val="1"/>
+      <w:numFmt w:val="lowerLetter"/>
+      <w:lvlText w:val="%5)"/>
+      <w:lvlJc w:val="left"/>
+      <w:pPr>
+        <w:ind w:left="2200" w:hanging="440"/>
+      </w:pPr>
+    </w:lvl>
+    <w:lvl w:ilvl="5" w:tplc="0409001B" w:tentative="1">
+      <w:start w:val="1"/>
+      <w:numFmt w:val="lowerRoman"/>
+      <w:lvlText w:val="%6."/>
+      <w:lvlJc w:val="right"/>
+      <w:pPr>
+        <w:ind w:left="2640" w:hanging="440"/>
+      </w:pPr>
+    </w:lvl>
+    <w:lvl w:ilvl="6" w:tplc="0409000F" w:tentative="1">
+      <w:start w:val="1"/>
+      <w:numFmt w:val="decimal"/>
+      <w:lvlText w:val="%7."/>
+      <w:lvlJc w:val="left"/>
+      <w:pPr>
+        <w:ind w:left="3080" w:hanging="440"/>
+      </w:pPr>
+    </w:lvl>
+    <w:lvl w:ilvl="7" w:tplc="04090019" w:tentative="1">
+      <w:start w:val="1"/>
+      <w:numFmt w:val="lowerLetter"/>
+      <w:lvlText w:val="%8)"/>
+      <w:lvlJc w:val="left"/>
+      <w:pPr>
+        <w:ind w:left="3520" w:hanging="440"/>
+      </w:pPr>
+    </w:lvl>
+    <w:lvl w:ilvl="8" w:tplc="0409001B" w:tentative="1">
+      <w:start w:val="1"/>
+      <w:numFmt w:val="lowerRoman"/>
+      <w:lvlText w:val="%9."/>
+      <w:lvlJc w:val="right"/>
+      <w:pPr>
+        <w:ind w:left="3960" w:hanging="440"/>
+      </w:pPr>
     </w:lvl>
   </w:abstractNum>
   <w:num w:numId="1" w16cid:durableId="1827822957">
@@ -967,6 +1174,9 @@
   <w:num w:numId="4" w16cid:durableId="401878016">
     <w:abstractNumId w:val="3"/>
   </w:num>
+  <w:num w:numId="5" w16cid:durableId="1224950961">
+    <w:abstractNumId w:val="4"/>
+  </w:num>
 </w:numbering>
 </file>
 
@@ -975,7 +1185,7 @@
   <w:docDefaults>
     <w:rPrDefault>
       <w:rPr>
-        <w:rFonts w:asciiTheme="minorHAnsi" w:eastAsiaTheme="minorHAnsi" w:hAnsiTheme="minorHAnsi" w:cstheme="minorBidi"/>
+        <w:rFonts w:asciiTheme="minorHAnsi" w:eastAsia="宋体" w:hAnsiTheme="minorHAnsi" w:cstheme="minorBidi"/>
         <w:sz w:val="22"/>
         <w:szCs w:val="22"/>
         <w:lang w:val="en-GB" w:eastAsia="en-US" w:bidi="ar-SA"/>
@@ -1365,7 +1575,7 @@
     <w:lsdException w:name="Unresolved Mention" w:semiHidden="1" w:unhideWhenUsed="1"/>
     <w:lsdException w:name="Smart Link" w:semiHidden="1" w:unhideWhenUsed="1"/>
   </w:latentStyles>
-  <w:style w:type="paragraph" w:default="1" w:styleId="Normal">
+  <w:style w:type="paragraph" w:default="1" w:styleId="a">
     <w:name w:val="Normal"/>
     <w:qFormat/>
     <w:rsid w:val="005072DF"/>
@@ -1376,11 +1586,11 @@
       <w:rFonts w:ascii="Arial" w:hAnsi="Arial" w:cs="Arial"/>
     </w:rPr>
   </w:style>
-  <w:style w:type="paragraph" w:styleId="Heading1">
+  <w:style w:type="paragraph" w:styleId="1">
     <w:name w:val="heading 1"/>
-    <w:basedOn w:val="ListParagraph"/>
-    <w:next w:val="Normal"/>
-    <w:link w:val="Heading1Char"/>
+    <w:basedOn w:val="a0"/>
+    <w:next w:val="a"/>
+    <w:link w:val="10"/>
     <w:uiPriority w:val="9"/>
     <w:qFormat/>
     <w:rsid w:val="001F5F3A"/>
@@ -1399,11 +1609,11 @@
       <w:szCs w:val="28"/>
     </w:rPr>
   </w:style>
-  <w:style w:type="paragraph" w:styleId="Heading2">
+  <w:style w:type="paragraph" w:styleId="2">
     <w:name w:val="heading 2"/>
-    <w:basedOn w:val="Heading1"/>
-    <w:next w:val="Normal"/>
-    <w:link w:val="Heading2Char"/>
+    <w:basedOn w:val="1"/>
+    <w:next w:val="a"/>
+    <w:link w:val="20"/>
     <w:uiPriority w:val="9"/>
     <w:unhideWhenUsed/>
     <w:qFormat/>
@@ -1421,13 +1631,12 @@
       <w:szCs w:val="22"/>
     </w:rPr>
   </w:style>
-  <w:style w:type="character" w:default="1" w:styleId="DefaultParagraphFont">
+  <w:style w:type="character" w:default="1" w:styleId="a1">
     <w:name w:val="Default Paragraph Font"/>
     <w:uiPriority w:val="1"/>
-    <w:semiHidden/>
     <w:unhideWhenUsed/>
   </w:style>
-  <w:style w:type="table" w:default="1" w:styleId="TableNormal">
+  <w:style w:type="table" w:default="1" w:styleId="a2">
     <w:name w:val="Normal Table"/>
     <w:uiPriority w:val="99"/>
     <w:semiHidden/>
@@ -1442,16 +1651,16 @@
       </w:tblCellMar>
     </w:tblPr>
   </w:style>
-  <w:style w:type="numbering" w:default="1" w:styleId="NoList">
+  <w:style w:type="numbering" w:default="1" w:styleId="a3">
     <w:name w:val="No List"/>
     <w:uiPriority w:val="99"/>
     <w:semiHidden/>
     <w:unhideWhenUsed/>
   </w:style>
-  <w:style w:type="paragraph" w:styleId="Header">
+  <w:style w:type="paragraph" w:styleId="a4">
     <w:name w:val="header"/>
-    <w:basedOn w:val="Normal"/>
-    <w:link w:val="HeaderChar"/>
+    <w:basedOn w:val="a"/>
+    <w:link w:val="a5"/>
     <w:uiPriority w:val="99"/>
     <w:unhideWhenUsed/>
     <w:rsid w:val="00A864C2"/>
@@ -1463,17 +1672,17 @@
       <w:spacing w:after="0" w:line="240" w:lineRule="auto"/>
     </w:pPr>
   </w:style>
-  <w:style w:type="character" w:customStyle="1" w:styleId="HeaderChar">
-    <w:name w:val="Header Char"/>
-    <w:basedOn w:val="DefaultParagraphFont"/>
-    <w:link w:val="Header"/>
+  <w:style w:type="character" w:customStyle="1" w:styleId="a5">
+    <w:name w:val="页眉 字符"/>
+    <w:basedOn w:val="a1"/>
+    <w:link w:val="a4"/>
     <w:uiPriority w:val="99"/>
     <w:rsid w:val="00A864C2"/>
   </w:style>
-  <w:style w:type="paragraph" w:styleId="Footer">
+  <w:style w:type="paragraph" w:styleId="a6">
     <w:name w:val="footer"/>
-    <w:basedOn w:val="Normal"/>
-    <w:link w:val="FooterChar"/>
+    <w:basedOn w:val="a"/>
+    <w:link w:val="a7"/>
     <w:uiPriority w:val="99"/>
     <w:unhideWhenUsed/>
     <w:rsid w:val="00A864C2"/>
@@ -1485,18 +1694,18 @@
       <w:spacing w:after="0" w:line="240" w:lineRule="auto"/>
     </w:pPr>
   </w:style>
-  <w:style w:type="character" w:customStyle="1" w:styleId="FooterChar">
-    <w:name w:val="Footer Char"/>
-    <w:basedOn w:val="DefaultParagraphFont"/>
-    <w:link w:val="Footer"/>
+  <w:style w:type="character" w:customStyle="1" w:styleId="a7">
+    <w:name w:val="页脚 字符"/>
+    <w:basedOn w:val="a1"/>
+    <w:link w:val="a6"/>
     <w:uiPriority w:val="99"/>
     <w:rsid w:val="00A864C2"/>
   </w:style>
-  <w:style w:type="paragraph" w:styleId="Title">
+  <w:style w:type="paragraph" w:styleId="a8">
     <w:name w:val="Title"/>
-    <w:basedOn w:val="Normal"/>
-    <w:next w:val="Normal"/>
-    <w:link w:val="TitleChar"/>
+    <w:basedOn w:val="a"/>
+    <w:next w:val="a"/>
+    <w:link w:val="a9"/>
     <w:uiPriority w:val="10"/>
     <w:qFormat/>
     <w:rsid w:val="00470AA9"/>
@@ -1510,10 +1719,10 @@
       <w:szCs w:val="28"/>
     </w:rPr>
   </w:style>
-  <w:style w:type="character" w:customStyle="1" w:styleId="TitleChar">
-    <w:name w:val="Title Char"/>
-    <w:basedOn w:val="DefaultParagraphFont"/>
-    <w:link w:val="Title"/>
+  <w:style w:type="character" w:customStyle="1" w:styleId="a9">
+    <w:name w:val="标题 字符"/>
+    <w:basedOn w:val="a1"/>
+    <w:link w:val="a8"/>
     <w:uiPriority w:val="10"/>
     <w:rsid w:val="00470AA9"/>
     <w:rPr>
@@ -1524,9 +1733,9 @@
       <w:szCs w:val="28"/>
     </w:rPr>
   </w:style>
-  <w:style w:type="table" w:styleId="TableGrid">
+  <w:style w:type="table" w:styleId="aa">
     <w:name w:val="Table Grid"/>
-    <w:basedOn w:val="TableNormal"/>
+    <w:basedOn w:val="a2"/>
     <w:uiPriority w:val="39"/>
     <w:rsid w:val="005072DF"/>
     <w:pPr>
@@ -1543,9 +1752,9 @@
       </w:tblBorders>
     </w:tblPr>
   </w:style>
-  <w:style w:type="character" w:styleId="PlaceholderText">
+  <w:style w:type="character" w:styleId="ab">
     <w:name w:val="Placeholder Text"/>
-    <w:basedOn w:val="DefaultParagraphFont"/>
+    <w:basedOn w:val="a1"/>
     <w:uiPriority w:val="99"/>
     <w:semiHidden/>
     <w:rsid w:val="005072DF"/>
@@ -1553,9 +1762,9 @@
       <w:color w:val="808080"/>
     </w:rPr>
   </w:style>
-  <w:style w:type="paragraph" w:styleId="ListParagraph">
+  <w:style w:type="paragraph" w:styleId="a0">
     <w:name w:val="List Paragraph"/>
-    <w:basedOn w:val="Normal"/>
+    <w:basedOn w:val="a"/>
     <w:uiPriority w:val="34"/>
     <w:qFormat/>
     <w:rsid w:val="00470AA9"/>
@@ -1564,10 +1773,10 @@
       <w:contextualSpacing/>
     </w:pPr>
   </w:style>
-  <w:style w:type="character" w:customStyle="1" w:styleId="Heading1Char">
-    <w:name w:val="Heading 1 Char"/>
-    <w:basedOn w:val="DefaultParagraphFont"/>
-    <w:link w:val="Heading1"/>
+  <w:style w:type="character" w:customStyle="1" w:styleId="10">
+    <w:name w:val="标题 1 字符"/>
+    <w:basedOn w:val="a1"/>
+    <w:link w:val="1"/>
     <w:uiPriority w:val="9"/>
     <w:rsid w:val="001F5F3A"/>
     <w:rPr>
@@ -1578,10 +1787,10 @@
       <w:szCs w:val="28"/>
     </w:rPr>
   </w:style>
-  <w:style w:type="character" w:customStyle="1" w:styleId="Heading2Char">
-    <w:name w:val="Heading 2 Char"/>
-    <w:basedOn w:val="DefaultParagraphFont"/>
-    <w:link w:val="Heading2"/>
+  <w:style w:type="character" w:customStyle="1" w:styleId="20">
+    <w:name w:val="标题 2 字符"/>
+    <w:basedOn w:val="a1"/>
+    <w:link w:val="2"/>
     <w:uiPriority w:val="9"/>
     <w:rsid w:val="00ED034F"/>
     <w:rPr>
@@ -1590,10 +1799,10 @@
       <w:bCs/>
     </w:rPr>
   </w:style>
-  <w:style w:type="paragraph" w:styleId="Caption">
+  <w:style w:type="paragraph" w:styleId="ac">
     <w:name w:val="caption"/>
-    <w:basedOn w:val="Normal"/>
-    <w:next w:val="Normal"/>
+    <w:basedOn w:val="a"/>
+    <w:next w:val="a"/>
     <w:uiPriority w:val="35"/>
     <w:unhideWhenUsed/>
     <w:qFormat/>
@@ -1608,10 +1817,10 @@
       <w:color w:val="44546A" w:themeColor="text2"/>
     </w:rPr>
   </w:style>
-  <w:style w:type="paragraph" w:styleId="TOCHeading">
+  <w:style w:type="paragraph" w:styleId="TOC">
     <w:name w:val="TOC Heading"/>
-    <w:basedOn w:val="Heading1"/>
-    <w:next w:val="Normal"/>
+    <w:basedOn w:val="1"/>
+    <w:next w:val="a"/>
     <w:uiPriority w:val="39"/>
     <w:unhideWhenUsed/>
     <w:qFormat/>
@@ -1638,8 +1847,8 @@
   </w:style>
   <w:style w:type="paragraph" w:styleId="TOC1">
     <w:name w:val="toc 1"/>
-    <w:basedOn w:val="Normal"/>
-    <w:next w:val="Normal"/>
+    <w:basedOn w:val="a"/>
+    <w:next w:val="a"/>
     <w:autoRedefine/>
     <w:uiPriority w:val="39"/>
     <w:unhideWhenUsed/>
@@ -1650,8 +1859,8 @@
   </w:style>
   <w:style w:type="paragraph" w:styleId="TOC2">
     <w:name w:val="toc 2"/>
-    <w:basedOn w:val="Normal"/>
-    <w:next w:val="Normal"/>
+    <w:basedOn w:val="a"/>
+    <w:next w:val="a"/>
     <w:autoRedefine/>
     <w:uiPriority w:val="39"/>
     <w:unhideWhenUsed/>
@@ -1661,9 +1870,9 @@
       <w:ind w:left="220"/>
     </w:pPr>
   </w:style>
-  <w:style w:type="character" w:styleId="Hyperlink">
+  <w:style w:type="character" w:styleId="ad">
     <w:name w:val="Hyperlink"/>
-    <w:basedOn w:val="DefaultParagraphFont"/>
+    <w:basedOn w:val="a1"/>
     <w:uiPriority w:val="99"/>
     <w:unhideWhenUsed/>
     <w:rsid w:val="00AF5424"/>
@@ -1672,17 +1881,17 @@
       <w:u w:val="single"/>
     </w:rPr>
   </w:style>
-  <w:style w:type="paragraph" w:styleId="Bibliography">
+  <w:style w:type="paragraph" w:styleId="ae">
     <w:name w:val="Bibliography"/>
-    <w:basedOn w:val="Normal"/>
-    <w:next w:val="Normal"/>
+    <w:basedOn w:val="a"/>
+    <w:next w:val="a"/>
     <w:uiPriority w:val="37"/>
     <w:unhideWhenUsed/>
     <w:rsid w:val="00CA7DEA"/>
   </w:style>
-  <w:style w:type="character" w:styleId="Emphasis">
+  <w:style w:type="character" w:styleId="af">
     <w:name w:val="Emphasis"/>
-    <w:basedOn w:val="DefaultParagraphFont"/>
+    <w:basedOn w:val="a1"/>
     <w:uiPriority w:val="20"/>
     <w:qFormat/>
     <w:rsid w:val="000A7D3A"/>
@@ -1691,9 +1900,9 @@
       <w:iCs/>
     </w:rPr>
   </w:style>
-  <w:style w:type="character" w:styleId="IntenseEmphasis">
+  <w:style w:type="character" w:styleId="af0">
     <w:name w:val="Intense Emphasis"/>
-    <w:basedOn w:val="DefaultParagraphFont"/>
+    <w:basedOn w:val="a1"/>
     <w:uiPriority w:val="21"/>
     <w:qFormat/>
     <w:rsid w:val="000A7D3A"/>

</xml_diff>

<commit_message>
finished task 1 with proper test
</commit_message>
<xml_diff>
--- a/MATLAB Coursework 2  Word Template.docx
+++ b/MATLAB Coursework 2  Word Template.docx
@@ -176,6 +176,7 @@
         <w:rPr>
           <w:color w:val="000000" w:themeColor="text1"/>
           <w:highlight w:val="cyan"/>
+          <w:lang w:eastAsia="zh-CN"/>
         </w:rPr>
       </w:pPr>
       <w:r>
@@ -226,11 +227,107 @@
         </w:drawing>
       </w:r>
     </w:p>
+    <w:p>
+      <w:pPr>
+        <w:pStyle w:val="a0"/>
+        <w:numPr>
+          <w:ilvl w:val="0"/>
+          <w:numId w:val="5"/>
+        </w:numPr>
+        <w:spacing w:line="259" w:lineRule="auto"/>
+        <w:jc w:val="both"/>
+        <w:rPr>
+          <w:color w:val="000000" w:themeColor="text1"/>
+          <w:highlight w:val="cyan"/>
+          <w:lang w:eastAsia="zh-CN"/>
+        </w:rPr>
+      </w:pPr>
+      <w:r>
+        <w:rPr>
+          <w:color w:val="000000" w:themeColor="text1"/>
+          <w:highlight w:val="cyan"/>
+          <w:lang w:eastAsia="zh-CN"/>
+        </w:rPr>
+        <w:t>T</w:t>
+      </w:r>
+      <w:r>
+        <w:rPr>
+          <w:rFonts w:hint="eastAsia"/>
+          <w:color w:val="000000" w:themeColor="text1"/>
+          <w:highlight w:val="cyan"/>
+          <w:lang w:eastAsia="zh-CN"/>
+        </w:rPr>
+        <w:t>emperature/time plot</w:t>
+      </w:r>
+    </w:p>
+    <w:p>
+      <w:pPr>
+        <w:pStyle w:val="a0"/>
+        <w:spacing w:line="259" w:lineRule="auto"/>
+        <w:ind w:left="360"/>
+        <w:jc w:val="both"/>
+        <w:rPr>
+          <w:rFonts w:hint="eastAsia"/>
+          <w:color w:val="000000" w:themeColor="text1"/>
+          <w:highlight w:val="cyan"/>
+          <w:lang w:eastAsia="zh-CN"/>
+        </w:rPr>
+      </w:pPr>
+      <w:r>
+        <w:rPr>
+          <w:rFonts w:hint="eastAsia"/>
+          <w:noProof/>
+          <w:color w:val="000000" w:themeColor="text1"/>
+          <w:lang w:eastAsia="zh-CN"/>
+        </w:rPr>
+        <w:drawing>
+          <wp:inline distT="0" distB="0" distL="0" distR="0" wp14:anchorId="78181EFD" wp14:editId="14587308">
+            <wp:extent cx="5400675" cy="3527252"/>
+            <wp:effectExtent l="0" t="0" r="0" b="0"/>
+            <wp:docPr id="2110072039" name="图片 3"/>
+            <wp:cNvGraphicFramePr>
+              <a:graphicFrameLocks xmlns:a="http://schemas.openxmlformats.org/drawingml/2006/main" noChangeAspect="1"/>
+            </wp:cNvGraphicFramePr>
+            <a:graphic xmlns:a="http://schemas.openxmlformats.org/drawingml/2006/main">
+              <a:graphicData uri="http://schemas.openxmlformats.org/drawingml/2006/picture">
+                <pic:pic xmlns:pic="http://schemas.openxmlformats.org/drawingml/2006/picture">
+                  <pic:nvPicPr>
+                    <pic:cNvPr id="2110072039" name="图片 2110072039"/>
+                    <pic:cNvPicPr/>
+                  </pic:nvPicPr>
+                  <pic:blipFill>
+                    <a:blip r:embed="rId9">
+                      <a:extLst>
+                        <a:ext uri="{28A0092B-C50C-407E-A947-70E740481C1C}">
+                          <a14:useLocalDpi xmlns:a14="http://schemas.microsoft.com/office/drawing/2010/main" val="0"/>
+                        </a:ext>
+                      </a:extLst>
+                    </a:blip>
+                    <a:stretch>
+                      <a:fillRect/>
+                    </a:stretch>
+                  </pic:blipFill>
+                  <pic:spPr>
+                    <a:xfrm>
+                      <a:off x="0" y="0"/>
+                      <a:ext cx="5408560" cy="3532402"/>
+                    </a:xfrm>
+                    <a:prstGeom prst="rect">
+                      <a:avLst/>
+                    </a:prstGeom>
+                  </pic:spPr>
+                </pic:pic>
+              </a:graphicData>
+            </a:graphic>
+          </wp:inline>
+        </w:drawing>
+      </w:r>
+    </w:p>
     <w:sectPr>
-      <w:headerReference w:type="default" r:id="rId9"/>
-      <w:footerReference w:type="default" r:id="rId10"/>
-      <w:headerReference w:type="first" r:id="rId11"/>
-      <w:footerReference w:type="first" r:id="rId12"/>
+      <w:headerReference w:type="default" r:id="rId10"/>
+      <w:footerReference w:type="default" r:id="rId11"/>
+      <w:headerReference w:type="first" r:id="rId12"/>
+      <w:footerReference w:type="first" r:id="rId13"/>
       <w:pgSz w:w="11906" w:h="16838"/>
       <w:pgMar w:top="1440" w:right="1440" w:bottom="1440" w:left="1440" w:header="850" w:footer="708" w:gutter="0"/>
       <w:cols w:space="708"/>
@@ -1634,6 +1731,7 @@
   <w:style w:type="character" w:default="1" w:styleId="a1">
     <w:name w:val="Default Paragraph Font"/>
     <w:uiPriority w:val="1"/>
+    <w:semiHidden/>
     <w:unhideWhenUsed/>
   </w:style>
   <w:style w:type="table" w:default="1" w:styleId="a2">

</xml_diff>

<commit_message>
Finished setup of temp monitor and finished drawing the flow chart
</commit_message>
<xml_diff>
--- a/MATLAB Coursework 2  Word Template.docx
+++ b/MATLAB Coursework 2  Word Template.docx
@@ -267,7 +267,6 @@
         <w:ind w:left="360"/>
         <w:jc w:val="both"/>
         <w:rPr>
-          <w:rFonts w:hint="eastAsia"/>
           <w:color w:val="000000" w:themeColor="text1"/>
           <w:highlight w:val="cyan"/>
           <w:lang w:eastAsia="zh-CN"/>
@@ -323,11 +322,349 @@
         </w:drawing>
       </w:r>
     </w:p>
+    <w:p>
+      <w:pPr>
+        <w:pStyle w:val="a0"/>
+        <w:spacing w:line="259" w:lineRule="auto"/>
+        <w:ind w:left="360"/>
+        <w:jc w:val="both"/>
+        <w:rPr>
+          <w:color w:val="000000" w:themeColor="text1"/>
+          <w:highlight w:val="cyan"/>
+          <w:lang w:eastAsia="zh-CN"/>
+        </w:rPr>
+      </w:pPr>
+    </w:p>
+    <w:p>
+      <w:pPr>
+        <w:pStyle w:val="a0"/>
+        <w:spacing w:line="259" w:lineRule="auto"/>
+        <w:ind w:left="360"/>
+        <w:jc w:val="both"/>
+        <w:rPr>
+          <w:color w:val="000000" w:themeColor="text1"/>
+          <w:highlight w:val="cyan"/>
+          <w:lang w:eastAsia="zh-CN"/>
+        </w:rPr>
+      </w:pPr>
+    </w:p>
+    <w:p>
+      <w:pPr>
+        <w:pStyle w:val="a0"/>
+        <w:spacing w:line="259" w:lineRule="auto"/>
+        <w:ind w:left="360"/>
+        <w:jc w:val="both"/>
+        <w:rPr>
+          <w:color w:val="000000" w:themeColor="text1"/>
+          <w:highlight w:val="cyan"/>
+          <w:lang w:eastAsia="zh-CN"/>
+        </w:rPr>
+      </w:pPr>
+    </w:p>
+    <w:p>
+      <w:pPr>
+        <w:pStyle w:val="a0"/>
+        <w:spacing w:line="259" w:lineRule="auto"/>
+        <w:ind w:left="360"/>
+        <w:jc w:val="both"/>
+        <w:rPr>
+          <w:color w:val="000000" w:themeColor="text1"/>
+          <w:highlight w:val="cyan"/>
+          <w:lang w:eastAsia="zh-CN"/>
+        </w:rPr>
+      </w:pPr>
+    </w:p>
+    <w:p>
+      <w:pPr>
+        <w:pStyle w:val="a0"/>
+        <w:spacing w:line="259" w:lineRule="auto"/>
+        <w:ind w:left="360"/>
+        <w:jc w:val="both"/>
+        <w:rPr>
+          <w:color w:val="000000" w:themeColor="text1"/>
+          <w:highlight w:val="cyan"/>
+          <w:lang w:eastAsia="zh-CN"/>
+        </w:rPr>
+      </w:pPr>
+    </w:p>
+    <w:p>
+      <w:pPr>
+        <w:pStyle w:val="a0"/>
+        <w:spacing w:line="259" w:lineRule="auto"/>
+        <w:ind w:left="360"/>
+        <w:jc w:val="both"/>
+        <w:rPr>
+          <w:color w:val="000000" w:themeColor="text1"/>
+          <w:highlight w:val="cyan"/>
+          <w:lang w:eastAsia="zh-CN"/>
+        </w:rPr>
+      </w:pPr>
+    </w:p>
+    <w:p>
+      <w:pPr>
+        <w:pStyle w:val="a0"/>
+        <w:spacing w:line="259" w:lineRule="auto"/>
+        <w:ind w:left="360"/>
+        <w:jc w:val="both"/>
+        <w:rPr>
+          <w:color w:val="000000" w:themeColor="text1"/>
+          <w:highlight w:val="cyan"/>
+          <w:lang w:eastAsia="zh-CN"/>
+        </w:rPr>
+      </w:pPr>
+      <w:r>
+        <w:rPr>
+          <w:rFonts w:hint="eastAsia"/>
+          <w:color w:val="000000" w:themeColor="text1"/>
+          <w:highlight w:val="cyan"/>
+          <w:lang w:eastAsia="zh-CN"/>
+        </w:rPr>
+        <w:lastRenderedPageBreak/>
+        <w:t xml:space="preserve">TASK 2: </w:t>
+      </w:r>
+    </w:p>
+    <w:p>
+      <w:pPr>
+        <w:pStyle w:val="a0"/>
+        <w:numPr>
+          <w:ilvl w:val="0"/>
+          <w:numId w:val="6"/>
+        </w:numPr>
+        <w:spacing w:line="259" w:lineRule="auto"/>
+        <w:jc w:val="both"/>
+        <w:rPr>
+          <w:color w:val="000000" w:themeColor="text1"/>
+          <w:highlight w:val="cyan"/>
+          <w:lang w:val="en-US" w:eastAsia="zh-CN"/>
+        </w:rPr>
+      </w:pPr>
+      <w:r>
+        <w:rPr>
+          <w:color w:val="000000" w:themeColor="text1"/>
+          <w:highlight w:val="cyan"/>
+          <w:lang w:val="en-US" w:eastAsia="zh-CN"/>
+        </w:rPr>
+        <w:t>Flowchart</w:t>
+      </w:r>
+    </w:p>
+    <w:p>
+      <w:pPr>
+        <w:pStyle w:val="a0"/>
+        <w:spacing w:line="259" w:lineRule="auto"/>
+        <w:jc w:val="both"/>
+        <w:rPr>
+          <w:color w:val="000000" w:themeColor="text1"/>
+          <w:highlight w:val="cyan"/>
+          <w:lang w:val="en-US" w:eastAsia="zh-CN"/>
+        </w:rPr>
+      </w:pPr>
+      <w:r>
+        <w:rPr>
+          <w:noProof/>
+          <w:color w:val="000000" w:themeColor="text1"/>
+          <w:lang w:val="en-US" w:eastAsia="zh-CN"/>
+        </w:rPr>
+        <w:drawing>
+          <wp:inline distT="0" distB="0" distL="0" distR="0" wp14:anchorId="15757D2D" wp14:editId="64F82372">
+            <wp:extent cx="5005388" cy="7542463"/>
+            <wp:effectExtent l="0" t="0" r="5080" b="1905"/>
+            <wp:docPr id="787273636" name="图片 3"/>
+            <wp:cNvGraphicFramePr>
+              <a:graphicFrameLocks xmlns:a="http://schemas.openxmlformats.org/drawingml/2006/main" noChangeAspect="1"/>
+            </wp:cNvGraphicFramePr>
+            <a:graphic xmlns:a="http://schemas.openxmlformats.org/drawingml/2006/main">
+              <a:graphicData uri="http://schemas.openxmlformats.org/drawingml/2006/picture">
+                <pic:pic xmlns:pic="http://schemas.openxmlformats.org/drawingml/2006/picture">
+                  <pic:nvPicPr>
+                    <pic:cNvPr id="787273636" name="图片 787273636"/>
+                    <pic:cNvPicPr/>
+                  </pic:nvPicPr>
+                  <pic:blipFill>
+                    <a:blip r:embed="rId10">
+                      <a:extLst>
+                        <a:ext uri="{28A0092B-C50C-407E-A947-70E740481C1C}">
+                          <a14:useLocalDpi xmlns:a14="http://schemas.microsoft.com/office/drawing/2010/main" val="0"/>
+                        </a:ext>
+                      </a:extLst>
+                    </a:blip>
+                    <a:stretch>
+                      <a:fillRect/>
+                    </a:stretch>
+                  </pic:blipFill>
+                  <pic:spPr>
+                    <a:xfrm>
+                      <a:off x="0" y="0"/>
+                      <a:ext cx="5012531" cy="7553227"/>
+                    </a:xfrm>
+                    <a:prstGeom prst="rect">
+                      <a:avLst/>
+                    </a:prstGeom>
+                  </pic:spPr>
+                </pic:pic>
+              </a:graphicData>
+            </a:graphic>
+          </wp:inline>
+        </w:drawing>
+      </w:r>
+    </w:p>
+    <w:p>
+      <w:pPr>
+        <w:pStyle w:val="a0"/>
+        <w:spacing w:line="259" w:lineRule="auto"/>
+        <w:jc w:val="both"/>
+        <w:rPr>
+          <w:color w:val="000000" w:themeColor="text1"/>
+          <w:highlight w:val="cyan"/>
+          <w:lang w:val="en-US" w:eastAsia="zh-CN"/>
+        </w:rPr>
+      </w:pPr>
+    </w:p>
+    <w:p>
+      <w:pPr>
+        <w:pStyle w:val="a0"/>
+        <w:spacing w:line="259" w:lineRule="auto"/>
+        <w:jc w:val="both"/>
+        <w:rPr>
+          <w:color w:val="000000" w:themeColor="text1"/>
+          <w:highlight w:val="cyan"/>
+          <w:lang w:val="en-US" w:eastAsia="zh-CN"/>
+        </w:rPr>
+      </w:pPr>
+    </w:p>
+    <w:p>
+      <w:pPr>
+        <w:pStyle w:val="a0"/>
+        <w:spacing w:line="259" w:lineRule="auto"/>
+        <w:jc w:val="both"/>
+        <w:rPr>
+          <w:color w:val="000000" w:themeColor="text1"/>
+          <w:highlight w:val="cyan"/>
+          <w:lang w:val="en-US" w:eastAsia="zh-CN"/>
+        </w:rPr>
+      </w:pPr>
+    </w:p>
+    <w:p>
+      <w:pPr>
+        <w:pStyle w:val="a0"/>
+        <w:spacing w:line="259" w:lineRule="auto"/>
+        <w:jc w:val="both"/>
+        <w:rPr>
+          <w:color w:val="000000" w:themeColor="text1"/>
+          <w:highlight w:val="cyan"/>
+          <w:lang w:val="en-US" w:eastAsia="zh-CN"/>
+        </w:rPr>
+      </w:pPr>
+    </w:p>
+    <w:p>
+      <w:pPr>
+        <w:pStyle w:val="a0"/>
+        <w:spacing w:line="259" w:lineRule="auto"/>
+        <w:jc w:val="both"/>
+        <w:rPr>
+          <w:color w:val="000000" w:themeColor="text1"/>
+          <w:highlight w:val="cyan"/>
+          <w:lang w:val="en-US" w:eastAsia="zh-CN"/>
+        </w:rPr>
+      </w:pPr>
+    </w:p>
+    <w:p>
+      <w:pPr>
+        <w:pStyle w:val="a0"/>
+        <w:numPr>
+          <w:ilvl w:val="0"/>
+          <w:numId w:val="6"/>
+        </w:numPr>
+        <w:spacing w:line="259" w:lineRule="auto"/>
+        <w:jc w:val="both"/>
+        <w:rPr>
+          <w:color w:val="000000" w:themeColor="text1"/>
+          <w:highlight w:val="cyan"/>
+          <w:lang w:val="en-US" w:eastAsia="zh-CN"/>
+        </w:rPr>
+      </w:pPr>
+      <w:r>
+        <w:rPr>
+          <w:color w:val="000000" w:themeColor="text1"/>
+          <w:highlight w:val="cyan"/>
+          <w:lang w:val="en-US" w:eastAsia="zh-CN"/>
+        </w:rPr>
+        <w:lastRenderedPageBreak/>
+        <w:t>Thermistor Version 2</w:t>
+      </w:r>
+      <w:r>
+        <w:rPr>
+          <w:color w:val="000000" w:themeColor="text1"/>
+          <w:highlight w:val="cyan"/>
+          <w:lang w:val="en-US" w:eastAsia="zh-CN"/>
+        </w:rPr>
+        <w:t xml:space="preserve"> Setup</w:t>
+      </w:r>
+    </w:p>
+    <w:p>
+      <w:pPr>
+        <w:pStyle w:val="a0"/>
+        <w:spacing w:line="259" w:lineRule="auto"/>
+        <w:jc w:val="both"/>
+        <w:rPr>
+          <w:color w:val="000000" w:themeColor="text1"/>
+          <w:highlight w:val="cyan"/>
+          <w:lang w:val="en-US" w:eastAsia="zh-CN"/>
+        </w:rPr>
+      </w:pPr>
+      <w:r>
+        <w:rPr>
+          <w:noProof/>
+          <w:color w:val="000000" w:themeColor="text1"/>
+          <w:lang w:val="en-US" w:eastAsia="zh-CN"/>
+        </w:rPr>
+        <w:drawing>
+          <wp:inline distT="0" distB="0" distL="0" distR="0" wp14:anchorId="4424ED67" wp14:editId="6D4A50A7">
+            <wp:extent cx="5038725" cy="2834213"/>
+            <wp:effectExtent l="0" t="0" r="0" b="4445"/>
+            <wp:docPr id="936979744" name="图片 4"/>
+            <wp:cNvGraphicFramePr>
+              <a:graphicFrameLocks xmlns:a="http://schemas.openxmlformats.org/drawingml/2006/main" noChangeAspect="1"/>
+            </wp:cNvGraphicFramePr>
+            <a:graphic xmlns:a="http://schemas.openxmlformats.org/drawingml/2006/main">
+              <a:graphicData uri="http://schemas.openxmlformats.org/drawingml/2006/picture">
+                <pic:pic xmlns:pic="http://schemas.openxmlformats.org/drawingml/2006/picture">
+                  <pic:nvPicPr>
+                    <pic:cNvPr id="936979744" name="图片 936979744"/>
+                    <pic:cNvPicPr/>
+                  </pic:nvPicPr>
+                  <pic:blipFill>
+                    <a:blip r:embed="rId11" cstate="print">
+                      <a:extLst>
+                        <a:ext uri="{28A0092B-C50C-407E-A947-70E740481C1C}">
+                          <a14:useLocalDpi xmlns:a14="http://schemas.microsoft.com/office/drawing/2010/main" val="0"/>
+                        </a:ext>
+                      </a:extLst>
+                    </a:blip>
+                    <a:stretch>
+                      <a:fillRect/>
+                    </a:stretch>
+                  </pic:blipFill>
+                  <pic:spPr>
+                    <a:xfrm>
+                      <a:off x="0" y="0"/>
+                      <a:ext cx="5041780" cy="2835931"/>
+                    </a:xfrm>
+                    <a:prstGeom prst="rect">
+                      <a:avLst/>
+                    </a:prstGeom>
+                  </pic:spPr>
+                </pic:pic>
+              </a:graphicData>
+            </a:graphic>
+          </wp:inline>
+        </w:drawing>
+      </w:r>
+    </w:p>
     <w:sectPr>
-      <w:headerReference w:type="default" r:id="rId10"/>
-      <w:footerReference w:type="default" r:id="rId11"/>
-      <w:headerReference w:type="first" r:id="rId12"/>
-      <w:footerReference w:type="first" r:id="rId13"/>
+      <w:headerReference w:type="default" r:id="rId12"/>
+      <w:footerReference w:type="default" r:id="rId13"/>
+      <w:headerReference w:type="first" r:id="rId14"/>
+      <w:footerReference w:type="first" r:id="rId15"/>
       <w:pgSz w:w="11906" w:h="16838"/>
       <w:pgMar w:top="1440" w:right="1440" w:bottom="1440" w:left="1440" w:header="850" w:footer="708" w:gutter="0"/>
       <w:cols w:space="708"/>
@@ -857,6 +1194,95 @@
     </w:lvl>
   </w:abstractNum>
   <w:abstractNum w:abstractNumId="1" w15:restartNumberingAfterBreak="0">
+    <w:nsid w:val="1F4E323B"/>
+    <w:multiLevelType w:val="hybridMultilevel"/>
+    <w:tmpl w:val="846C8E66"/>
+    <w:lvl w:ilvl="0" w:tplc="8D0C6C70">
+      <w:start w:val="1"/>
+      <w:numFmt w:val="decimal"/>
+      <w:lvlText w:val="%1)"/>
+      <w:lvlJc w:val="left"/>
+      <w:pPr>
+        <w:ind w:left="720" w:hanging="360"/>
+      </w:pPr>
+      <w:rPr>
+        <w:rFonts w:hint="default"/>
+      </w:rPr>
+    </w:lvl>
+    <w:lvl w:ilvl="1" w:tplc="04090019" w:tentative="1">
+      <w:start w:val="1"/>
+      <w:numFmt w:val="lowerLetter"/>
+      <w:lvlText w:val="%2)"/>
+      <w:lvlJc w:val="left"/>
+      <w:pPr>
+        <w:ind w:left="1240" w:hanging="440"/>
+      </w:pPr>
+    </w:lvl>
+    <w:lvl w:ilvl="2" w:tplc="0409001B" w:tentative="1">
+      <w:start w:val="1"/>
+      <w:numFmt w:val="lowerRoman"/>
+      <w:lvlText w:val="%3."/>
+      <w:lvlJc w:val="right"/>
+      <w:pPr>
+        <w:ind w:left="1680" w:hanging="440"/>
+      </w:pPr>
+    </w:lvl>
+    <w:lvl w:ilvl="3" w:tplc="0409000F" w:tentative="1">
+      <w:start w:val="1"/>
+      <w:numFmt w:val="decimal"/>
+      <w:lvlText w:val="%4."/>
+      <w:lvlJc w:val="left"/>
+      <w:pPr>
+        <w:ind w:left="2120" w:hanging="440"/>
+      </w:pPr>
+    </w:lvl>
+    <w:lvl w:ilvl="4" w:tplc="04090019" w:tentative="1">
+      <w:start w:val="1"/>
+      <w:numFmt w:val="lowerLetter"/>
+      <w:lvlText w:val="%5)"/>
+      <w:lvlJc w:val="left"/>
+      <w:pPr>
+        <w:ind w:left="2560" w:hanging="440"/>
+      </w:pPr>
+    </w:lvl>
+    <w:lvl w:ilvl="5" w:tplc="0409001B" w:tentative="1">
+      <w:start w:val="1"/>
+      <w:numFmt w:val="lowerRoman"/>
+      <w:lvlText w:val="%6."/>
+      <w:lvlJc w:val="right"/>
+      <w:pPr>
+        <w:ind w:left="3000" w:hanging="440"/>
+      </w:pPr>
+    </w:lvl>
+    <w:lvl w:ilvl="6" w:tplc="0409000F" w:tentative="1">
+      <w:start w:val="1"/>
+      <w:numFmt w:val="decimal"/>
+      <w:lvlText w:val="%7."/>
+      <w:lvlJc w:val="left"/>
+      <w:pPr>
+        <w:ind w:left="3440" w:hanging="440"/>
+      </w:pPr>
+    </w:lvl>
+    <w:lvl w:ilvl="7" w:tplc="04090019" w:tentative="1">
+      <w:start w:val="1"/>
+      <w:numFmt w:val="lowerLetter"/>
+      <w:lvlText w:val="%8)"/>
+      <w:lvlJc w:val="left"/>
+      <w:pPr>
+        <w:ind w:left="3880" w:hanging="440"/>
+      </w:pPr>
+    </w:lvl>
+    <w:lvl w:ilvl="8" w:tplc="0409001B" w:tentative="1">
+      <w:start w:val="1"/>
+      <w:numFmt w:val="lowerRoman"/>
+      <w:lvlText w:val="%9."/>
+      <w:lvlJc w:val="right"/>
+      <w:pPr>
+        <w:ind w:left="4320" w:hanging="440"/>
+      </w:pPr>
+    </w:lvl>
+  </w:abstractNum>
+  <w:abstractNum w:abstractNumId="2" w15:restartNumberingAfterBreak="0">
     <w:nsid w:val="49D82E44"/>
     <w:multiLevelType w:val="multilevel"/>
     <w:tmpl w:val="6B982794"/>
@@ -944,7 +1370,7 @@
       </w:pPr>
     </w:lvl>
   </w:abstractNum>
-  <w:abstractNum w:abstractNumId="2" w15:restartNumberingAfterBreak="0">
+  <w:abstractNum w:abstractNumId="3" w15:restartNumberingAfterBreak="0">
     <w:nsid w:val="509A57DD"/>
     <w:multiLevelType w:val="hybridMultilevel"/>
     <w:tmpl w:val="25F4533C"/>
@@ -1057,7 +1483,7 @@
       </w:rPr>
     </w:lvl>
   </w:abstractNum>
-  <w:abstractNum w:abstractNumId="3" w15:restartNumberingAfterBreak="0">
+  <w:abstractNum w:abstractNumId="4" w15:restartNumberingAfterBreak="0">
     <w:nsid w:val="54237D38"/>
     <w:multiLevelType w:val="hybridMultilevel"/>
     <w:tmpl w:val="2828F10A"/>
@@ -1170,7 +1596,7 @@
       </w:rPr>
     </w:lvl>
   </w:abstractNum>
-  <w:abstractNum w:abstractNumId="4" w15:restartNumberingAfterBreak="0">
+  <w:abstractNum w:abstractNumId="5" w15:restartNumberingAfterBreak="0">
     <w:nsid w:val="596A136B"/>
     <w:multiLevelType w:val="hybridMultilevel"/>
     <w:tmpl w:val="E8A47C52"/>
@@ -1260,19 +1686,22 @@
     </w:lvl>
   </w:abstractNum>
   <w:num w:numId="1" w16cid:durableId="1827822957">
-    <w:abstractNumId w:val="1"/>
+    <w:abstractNumId w:val="2"/>
   </w:num>
   <w:num w:numId="2" w16cid:durableId="907231765">
     <w:abstractNumId w:val="0"/>
   </w:num>
   <w:num w:numId="3" w16cid:durableId="1932926543">
-    <w:abstractNumId w:val="2"/>
+    <w:abstractNumId w:val="3"/>
   </w:num>
   <w:num w:numId="4" w16cid:durableId="401878016">
-    <w:abstractNumId w:val="3"/>
+    <w:abstractNumId w:val="4"/>
   </w:num>
   <w:num w:numId="5" w16cid:durableId="1224950961">
-    <w:abstractNumId w:val="4"/>
+    <w:abstractNumId w:val="5"/>
+  </w:num>
+  <w:num w:numId="6" w16cid:durableId="1108813701">
+    <w:abstractNumId w:val="1"/>
   </w:num>
 </w:numbering>
 </file>

</xml_diff>

<commit_message>
Added function gate Added the flow chart after finish task2 and the plot
</commit_message>
<xml_diff>
--- a/MATLAB Coursework 2  Word Template.docx
+++ b/MATLAB Coursework 2  Word Template.docx
@@ -2,7 +2,14 @@
 <file path=word/document.xml><?xml version="1.0" encoding="utf-8"?>
 <w:document xmlns:wpc="http://schemas.microsoft.com/office/word/2010/wordprocessingCanvas" xmlns:cx="http://schemas.microsoft.com/office/drawing/2014/chartex" xmlns:cx1="http://schemas.microsoft.com/office/drawing/2015/9/8/chartex" xmlns:cx2="http://schemas.microsoft.com/office/drawing/2015/10/21/chartex" xmlns:cx3="http://schemas.microsoft.com/office/drawing/2016/5/9/chartex" xmlns:cx4="http://schemas.microsoft.com/office/drawing/2016/5/10/chartex" xmlns:cx5="http://schemas.microsoft.com/office/drawing/2016/5/11/chartex" xmlns:cx6="http://schemas.microsoft.com/office/drawing/2016/5/12/chartex" xmlns:cx7="http://schemas.microsoft.com/office/drawing/2016/5/13/chartex" xmlns:cx8="http://schemas.microsoft.com/office/drawing/2016/5/14/chartex" xmlns:mc="http://schemas.openxmlformats.org/markup-compatibility/2006" xmlns:aink="http://schemas.microsoft.com/office/drawing/2016/ink" xmlns:am3d="http://schemas.microsoft.com/office/drawing/2017/model3d" xmlns:o="urn:schemas-microsoft-com:office:office" xmlns:oel="http://schemas.microsoft.com/office/2019/extlst" xmlns:r="http://schemas.openxmlformats.org/officeDocument/2006/relationships" xmlns:m="http://schemas.openxmlformats.org/officeDocument/2006/math" xmlns:v="urn:schemas-microsoft-com:vml" xmlns:wp14="http://schemas.microsoft.com/office/word/2010/wordprocessingDrawing" xmlns:wp="http://schemas.openxmlformats.org/drawingml/2006/wordprocessingDrawing" xmlns:w10="urn:schemas-microsoft-com:office:word" xmlns:w="http://schemas.openxmlformats.org/wordprocessingml/2006/main" xmlns:w14="http://schemas.microsoft.com/office/word/2010/wordml" xmlns:w15="http://schemas.microsoft.com/office/word/2012/wordml" xmlns:w16cex="http://schemas.microsoft.com/office/word/2018/wordml/cex" xmlns:w16cid="http://schemas.microsoft.com/office/word/2016/wordml/cid" xmlns:w16="http://schemas.microsoft.com/office/word/2018/wordml" xmlns:w16du="http://schemas.microsoft.com/office/word/2023/wordml/word16du" xmlns:w16sdtdh="http://schemas.microsoft.com/office/word/2020/wordml/sdtdatahash" xmlns:w16sdtfl="http://schemas.microsoft.com/office/word/2024/wordml/sdtformatlock" xmlns:w16se="http://schemas.microsoft.com/office/word/2015/wordml/symex" xmlns:wpg="http://schemas.microsoft.com/office/word/2010/wordprocessingGroup" xmlns:wpi="http://schemas.microsoft.com/office/word/2010/wordprocessingInk" xmlns:wne="http://schemas.microsoft.com/office/word/2006/wordml" xmlns:wps="http://schemas.microsoft.com/office/word/2010/wordprocessingShape" mc:Ignorable="w14 w15 w16se w16cid w16 w16cex w16sdtdh w16sdtfl w16du wp14">
   <w:body>
-    <w:p/>
+    <w:p>
+      <w:pPr>
+        <w:rPr>
+          <w:rFonts w:hint="eastAsia"/>
+          <w:lang w:eastAsia="zh-CN"/>
+        </w:rPr>
+      </w:pPr>
+    </w:p>
     <w:p/>
     <w:p/>
     <w:p/>
@@ -660,11 +667,206 @@
         </w:drawing>
       </w:r>
     </w:p>
+    <w:p>
+      <w:pPr>
+        <w:pStyle w:val="a0"/>
+        <w:spacing w:line="259" w:lineRule="auto"/>
+        <w:jc w:val="both"/>
+        <w:rPr>
+          <w:color w:val="000000" w:themeColor="text1"/>
+          <w:highlight w:val="cyan"/>
+          <w:lang w:val="en-US" w:eastAsia="zh-CN"/>
+        </w:rPr>
+      </w:pPr>
+    </w:p>
+    <w:p>
+      <w:pPr>
+        <w:pStyle w:val="a0"/>
+        <w:numPr>
+          <w:ilvl w:val="0"/>
+          <w:numId w:val="6"/>
+        </w:numPr>
+        <w:spacing w:line="259" w:lineRule="auto"/>
+        <w:jc w:val="both"/>
+        <w:rPr>
+          <w:color w:val="000000" w:themeColor="text1"/>
+          <w:highlight w:val="cyan"/>
+          <w:lang w:val="en-US" w:eastAsia="zh-CN"/>
+        </w:rPr>
+      </w:pPr>
+      <w:r>
+        <w:rPr>
+          <w:color w:val="000000" w:themeColor="text1"/>
+          <w:highlight w:val="cyan"/>
+          <w:lang w:val="en-US" w:eastAsia="zh-CN"/>
+        </w:rPr>
+        <w:t>Temperature monitor test plot</w:t>
+      </w:r>
+    </w:p>
+    <w:p>
+      <w:pPr>
+        <w:pStyle w:val="a0"/>
+        <w:spacing w:line="259" w:lineRule="auto"/>
+        <w:jc w:val="both"/>
+        <w:rPr>
+          <w:color w:val="000000" w:themeColor="text1"/>
+          <w:highlight w:val="cyan"/>
+          <w:lang w:val="en-US" w:eastAsia="zh-CN"/>
+        </w:rPr>
+      </w:pPr>
+      <w:r>
+        <w:rPr>
+          <w:noProof/>
+          <w:color w:val="000000" w:themeColor="text1"/>
+          <w:lang w:val="en-US" w:eastAsia="zh-CN"/>
+        </w:rPr>
+        <w:drawing>
+          <wp:inline distT="0" distB="0" distL="0" distR="0" wp14:anchorId="5CCD8B65" wp14:editId="0BA8FBD5">
+            <wp:extent cx="5295900" cy="3503414"/>
+            <wp:effectExtent l="0" t="0" r="0" b="1905"/>
+            <wp:docPr id="901571758" name="图片 3"/>
+            <wp:cNvGraphicFramePr>
+              <a:graphicFrameLocks xmlns:a="http://schemas.openxmlformats.org/drawingml/2006/main" noChangeAspect="1"/>
+            </wp:cNvGraphicFramePr>
+            <a:graphic xmlns:a="http://schemas.openxmlformats.org/drawingml/2006/main">
+              <a:graphicData uri="http://schemas.openxmlformats.org/drawingml/2006/picture">
+                <pic:pic xmlns:pic="http://schemas.openxmlformats.org/drawingml/2006/picture">
+                  <pic:nvPicPr>
+                    <pic:cNvPr id="901571758" name="图片 901571758"/>
+                    <pic:cNvPicPr/>
+                  </pic:nvPicPr>
+                  <pic:blipFill>
+                    <a:blip r:embed="rId12">
+                      <a:extLst>
+                        <a:ext uri="{28A0092B-C50C-407E-A947-70E740481C1C}">
+                          <a14:useLocalDpi xmlns:a14="http://schemas.microsoft.com/office/drawing/2010/main" val="0"/>
+                        </a:ext>
+                      </a:extLst>
+                    </a:blip>
+                    <a:stretch>
+                      <a:fillRect/>
+                    </a:stretch>
+                  </pic:blipFill>
+                  <pic:spPr>
+                    <a:xfrm>
+                      <a:off x="0" y="0"/>
+                      <a:ext cx="5301809" cy="3507323"/>
+                    </a:xfrm>
+                    <a:prstGeom prst="rect">
+                      <a:avLst/>
+                    </a:prstGeom>
+                  </pic:spPr>
+                </pic:pic>
+              </a:graphicData>
+            </a:graphic>
+          </wp:inline>
+        </w:drawing>
+      </w:r>
+    </w:p>
+    <w:p>
+      <w:pPr>
+        <w:pStyle w:val="a0"/>
+        <w:spacing w:line="259" w:lineRule="auto"/>
+        <w:jc w:val="both"/>
+        <w:rPr>
+          <w:color w:val="000000" w:themeColor="text1"/>
+          <w:highlight w:val="cyan"/>
+          <w:lang w:val="en-US" w:eastAsia="zh-CN"/>
+        </w:rPr>
+      </w:pPr>
+    </w:p>
+    <w:p>
+      <w:pPr>
+        <w:pStyle w:val="a0"/>
+        <w:numPr>
+          <w:ilvl w:val="0"/>
+          <w:numId w:val="6"/>
+        </w:numPr>
+        <w:spacing w:line="259" w:lineRule="auto"/>
+        <w:jc w:val="both"/>
+        <w:rPr>
+          <w:color w:val="000000" w:themeColor="text1"/>
+          <w:highlight w:val="cyan"/>
+          <w:lang w:val="en-US" w:eastAsia="zh-CN"/>
+        </w:rPr>
+      </w:pPr>
+      <w:r>
+        <w:rPr>
+          <w:color w:val="000000" w:themeColor="text1"/>
+          <w:highlight w:val="cyan"/>
+          <w:lang w:val="en-US" w:eastAsia="zh-CN"/>
+        </w:rPr>
+        <w:t>Flowchart after finish</w:t>
+      </w:r>
+    </w:p>
+    <w:p>
+      <w:pPr>
+        <w:pStyle w:val="a0"/>
+        <w:spacing w:line="259" w:lineRule="auto"/>
+        <w:jc w:val="both"/>
+        <w:rPr>
+          <w:color w:val="000000" w:themeColor="text1"/>
+          <w:highlight w:val="cyan"/>
+          <w:lang w:val="en-US" w:eastAsia="zh-CN"/>
+        </w:rPr>
+      </w:pPr>
+      <w:r>
+        <w:rPr>
+          <w:noProof/>
+          <w:color w:val="000000" w:themeColor="text1"/>
+          <w:lang w:val="en-US" w:eastAsia="zh-CN"/>
+        </w:rPr>
+        <w:lastRenderedPageBreak/>
+        <w:drawing>
+          <wp:inline distT="0" distB="0" distL="0" distR="0" wp14:anchorId="6E64C27D" wp14:editId="3FE28A90">
+            <wp:extent cx="4372610" cy="8863330"/>
+            <wp:effectExtent l="0" t="0" r="8890" b="0"/>
+            <wp:docPr id="1134730711" name="图片 4"/>
+            <wp:cNvGraphicFramePr>
+              <a:graphicFrameLocks xmlns:a="http://schemas.openxmlformats.org/drawingml/2006/main" noChangeAspect="1"/>
+            </wp:cNvGraphicFramePr>
+            <a:graphic xmlns:a="http://schemas.openxmlformats.org/drawingml/2006/main">
+              <a:graphicData uri="http://schemas.openxmlformats.org/drawingml/2006/picture">
+                <pic:pic xmlns:pic="http://schemas.openxmlformats.org/drawingml/2006/picture">
+                  <pic:nvPicPr>
+                    <pic:cNvPr id="1134730711" name="图片 1134730711"/>
+                    <pic:cNvPicPr/>
+                  </pic:nvPicPr>
+                  <pic:blipFill>
+                    <a:blip r:embed="rId13">
+                      <a:extLst>
+                        <a:ext uri="{28A0092B-C50C-407E-A947-70E740481C1C}">
+                          <a14:useLocalDpi xmlns:a14="http://schemas.microsoft.com/office/drawing/2010/main" val="0"/>
+                        </a:ext>
+                      </a:extLst>
+                    </a:blip>
+                    <a:stretch>
+                      <a:fillRect/>
+                    </a:stretch>
+                  </pic:blipFill>
+                  <pic:spPr>
+                    <a:xfrm>
+                      <a:off x="0" y="0"/>
+                      <a:ext cx="4372610" cy="8863330"/>
+                    </a:xfrm>
+                    <a:prstGeom prst="rect">
+                      <a:avLst/>
+                    </a:prstGeom>
+                  </pic:spPr>
+                </pic:pic>
+              </a:graphicData>
+            </a:graphic>
+          </wp:inline>
+        </w:drawing>
+      </w:r>
+    </w:p>
     <w:sectPr>
-      <w:headerReference w:type="default" r:id="rId12"/>
-      <w:footerReference w:type="default" r:id="rId13"/>
-      <w:headerReference w:type="first" r:id="rId14"/>
-      <w:footerReference w:type="first" r:id="rId15"/>
+      <w:headerReference w:type="even" r:id="rId14"/>
+      <w:headerReference w:type="default" r:id="rId15"/>
+      <w:footerReference w:type="even" r:id="rId16"/>
+      <w:footerReference w:type="default" r:id="rId17"/>
+      <w:headerReference w:type="first" r:id="rId18"/>
+      <w:footerReference w:type="first" r:id="rId19"/>
       <w:pgSz w:w="11906" w:h="16838"/>
       <w:pgMar w:top="1440" w:right="1440" w:bottom="1440" w:left="1440" w:header="850" w:footer="708" w:gutter="0"/>
       <w:cols w:space="708"/>
@@ -702,6 +904,16 @@
 </file>
 
 <file path=word/footer1.xml><?xml version="1.0" encoding="utf-8"?>
+<w:ftr xmlns:wpc="http://schemas.microsoft.com/office/word/2010/wordprocessingCanvas" xmlns:cx="http://schemas.microsoft.com/office/drawing/2014/chartex" xmlns:cx1="http://schemas.microsoft.com/office/drawing/2015/9/8/chartex" xmlns:cx2="http://schemas.microsoft.com/office/drawing/2015/10/21/chartex" xmlns:cx3="http://schemas.microsoft.com/office/drawing/2016/5/9/chartex" xmlns:cx4="http://schemas.microsoft.com/office/drawing/2016/5/10/chartex" xmlns:cx5="http://schemas.microsoft.com/office/drawing/2016/5/11/chartex" xmlns:cx6="http://schemas.microsoft.com/office/drawing/2016/5/12/chartex" xmlns:cx7="http://schemas.microsoft.com/office/drawing/2016/5/13/chartex" xmlns:cx8="http://schemas.microsoft.com/office/drawing/2016/5/14/chartex" xmlns:mc="http://schemas.openxmlformats.org/markup-compatibility/2006" xmlns:aink="http://schemas.microsoft.com/office/drawing/2016/ink" xmlns:am3d="http://schemas.microsoft.com/office/drawing/2017/model3d" xmlns:o="urn:schemas-microsoft-com:office:office" xmlns:oel="http://schemas.microsoft.com/office/2019/extlst" xmlns:r="http://schemas.openxmlformats.org/officeDocument/2006/relationships" xmlns:m="http://schemas.openxmlformats.org/officeDocument/2006/math" xmlns:v="urn:schemas-microsoft-com:vml" xmlns:wp14="http://schemas.microsoft.com/office/word/2010/wordprocessingDrawing" xmlns:wp="http://schemas.openxmlformats.org/drawingml/2006/wordprocessingDrawing" xmlns:w10="urn:schemas-microsoft-com:office:word" xmlns:w="http://schemas.openxmlformats.org/wordprocessingml/2006/main" xmlns:w14="http://schemas.microsoft.com/office/word/2010/wordml" xmlns:w15="http://schemas.microsoft.com/office/word/2012/wordml" xmlns:w16cex="http://schemas.microsoft.com/office/word/2018/wordml/cex" xmlns:w16cid="http://schemas.microsoft.com/office/word/2016/wordml/cid" xmlns:w16="http://schemas.microsoft.com/office/word/2018/wordml" xmlns:w16du="http://schemas.microsoft.com/office/word/2023/wordml/word16du" xmlns:w16sdtdh="http://schemas.microsoft.com/office/word/2020/wordml/sdtdatahash" xmlns:w16sdtfl="http://schemas.microsoft.com/office/word/2024/wordml/sdtformatlock" xmlns:w16se="http://schemas.microsoft.com/office/word/2015/wordml/symex" xmlns:wpg="http://schemas.microsoft.com/office/word/2010/wordprocessingGroup" xmlns:wpi="http://schemas.microsoft.com/office/word/2010/wordprocessingInk" xmlns:wne="http://schemas.microsoft.com/office/word/2006/wordml" xmlns:wps="http://schemas.microsoft.com/office/word/2010/wordprocessingShape" mc:Ignorable="w14 w15 w16se w16cid w16 w16cex w16sdtdh w16sdtfl w16du wp14">
+  <w:p>
+    <w:pPr>
+      <w:pStyle w:val="a6"/>
+    </w:pPr>
+  </w:p>
+</w:ftr>
+</file>
+
+<file path=word/footer2.xml><?xml version="1.0" encoding="utf-8"?>
 <w:ftr xmlns:wpc="http://schemas.microsoft.com/office/word/2010/wordprocessingCanvas" xmlns:cx="http://schemas.microsoft.com/office/drawing/2014/chartex" xmlns:cx1="http://schemas.microsoft.com/office/drawing/2015/9/8/chartex" xmlns:cx2="http://schemas.microsoft.com/office/drawing/2015/10/21/chartex" xmlns:cx3="http://schemas.microsoft.com/office/drawing/2016/5/9/chartex" xmlns:cx4="http://schemas.microsoft.com/office/drawing/2016/5/10/chartex" xmlns:cx5="http://schemas.microsoft.com/office/drawing/2016/5/11/chartex" xmlns:cx6="http://schemas.microsoft.com/office/drawing/2016/5/12/chartex" xmlns:cx7="http://schemas.microsoft.com/office/drawing/2016/5/13/chartex" xmlns:cx8="http://schemas.microsoft.com/office/drawing/2016/5/14/chartex" xmlns:mc="http://schemas.openxmlformats.org/markup-compatibility/2006" xmlns:aink="http://schemas.microsoft.com/office/drawing/2016/ink" xmlns:am3d="http://schemas.microsoft.com/office/drawing/2017/model3d" xmlns:o="urn:schemas-microsoft-com:office:office" xmlns:oel="http://schemas.microsoft.com/office/2019/extlst" xmlns:r="http://schemas.openxmlformats.org/officeDocument/2006/relationships" xmlns:m="http://schemas.openxmlformats.org/officeDocument/2006/math" xmlns:v="urn:schemas-microsoft-com:vml" xmlns:wp14="http://schemas.microsoft.com/office/word/2010/wordprocessingDrawing" xmlns:wp="http://schemas.openxmlformats.org/drawingml/2006/wordprocessingDrawing" xmlns:w10="urn:schemas-microsoft-com:office:word" xmlns:w="http://schemas.openxmlformats.org/wordprocessingml/2006/main" xmlns:w14="http://schemas.microsoft.com/office/word/2010/wordml" xmlns:w15="http://schemas.microsoft.com/office/word/2012/wordml" xmlns:w16cex="http://schemas.microsoft.com/office/word/2018/wordml/cex" xmlns:w16cid="http://schemas.microsoft.com/office/word/2016/wordml/cid" xmlns:w16="http://schemas.microsoft.com/office/word/2018/wordml" xmlns:w16du="http://schemas.microsoft.com/office/word/2023/wordml/word16du" xmlns:w16sdtdh="http://schemas.microsoft.com/office/word/2020/wordml/sdtdatahash" xmlns:w16sdtfl="http://schemas.microsoft.com/office/word/2024/wordml/sdtformatlock" xmlns:w16se="http://schemas.microsoft.com/office/word/2015/wordml/symex" xmlns:wpg="http://schemas.microsoft.com/office/word/2010/wordprocessingGroup" xmlns:wpi="http://schemas.microsoft.com/office/word/2010/wordprocessingInk" xmlns:wne="http://schemas.microsoft.com/office/word/2006/wordml" xmlns:wps="http://schemas.microsoft.com/office/word/2010/wordprocessingShape" mc:Ignorable="w14 w15 w16se w16cid w16 w16cex w16sdtdh w16sdtfl w16du wp14">
   <w:sdt>
     <w:sdtPr>
@@ -825,19 +1037,8 @@
         <w:iCs/>
         <w:sz w:val="18"/>
         <w:szCs w:val="18"/>
-        <w:highlight w:val="yellow"/>
       </w:rPr>
-      <w:t>Your name</w:t>
-    </w:r>
-    <w:r>
-      <w:rPr>
-        <w:i/>
-        <w:iCs/>
-        <w:sz w:val="18"/>
-        <w:szCs w:val="18"/>
-        <w:highlight w:val="yellow"/>
-      </w:rPr>
-      <w:t>, student ID</w:t>
+      <w:t>Ruixuan ZOU 20719241</w:t>
     </w:r>
     <w:r>
       <w:rPr>
@@ -852,7 +1053,7 @@
 </w:ftr>
 </file>
 
-<file path=word/footer2.xml><?xml version="1.0" encoding="utf-8"?>
+<file path=word/footer3.xml><?xml version="1.0" encoding="utf-8"?>
 <w:ftr xmlns:wpc="http://schemas.microsoft.com/office/word/2010/wordprocessingCanvas" xmlns:cx="http://schemas.microsoft.com/office/drawing/2014/chartex" xmlns:cx1="http://schemas.microsoft.com/office/drawing/2015/9/8/chartex" xmlns:cx2="http://schemas.microsoft.com/office/drawing/2015/10/21/chartex" xmlns:cx3="http://schemas.microsoft.com/office/drawing/2016/5/9/chartex" xmlns:cx4="http://schemas.microsoft.com/office/drawing/2016/5/10/chartex" xmlns:cx5="http://schemas.microsoft.com/office/drawing/2016/5/11/chartex" xmlns:cx6="http://schemas.microsoft.com/office/drawing/2016/5/12/chartex" xmlns:cx7="http://schemas.microsoft.com/office/drawing/2016/5/13/chartex" xmlns:cx8="http://schemas.microsoft.com/office/drawing/2016/5/14/chartex" xmlns:mc="http://schemas.openxmlformats.org/markup-compatibility/2006" xmlns:aink="http://schemas.microsoft.com/office/drawing/2016/ink" xmlns:am3d="http://schemas.microsoft.com/office/drawing/2017/model3d" xmlns:o="urn:schemas-microsoft-com:office:office" xmlns:oel="http://schemas.microsoft.com/office/2019/extlst" xmlns:r="http://schemas.openxmlformats.org/officeDocument/2006/relationships" xmlns:m="http://schemas.openxmlformats.org/officeDocument/2006/math" xmlns:v="urn:schemas-microsoft-com:vml" xmlns:wp14="http://schemas.microsoft.com/office/word/2010/wordprocessingDrawing" xmlns:wp="http://schemas.openxmlformats.org/drawingml/2006/wordprocessingDrawing" xmlns:w10="urn:schemas-microsoft-com:office:word" xmlns:w="http://schemas.openxmlformats.org/wordprocessingml/2006/main" xmlns:w14="http://schemas.microsoft.com/office/word/2010/wordml" xmlns:w15="http://schemas.microsoft.com/office/word/2012/wordml" xmlns:w16cex="http://schemas.microsoft.com/office/word/2018/wordml/cex" xmlns:w16cid="http://schemas.microsoft.com/office/word/2016/wordml/cid" xmlns:w16="http://schemas.microsoft.com/office/word/2018/wordml" xmlns:w16du="http://schemas.microsoft.com/office/word/2023/wordml/word16du" xmlns:w16sdtdh="http://schemas.microsoft.com/office/word/2020/wordml/sdtdatahash" xmlns:w16sdtfl="http://schemas.microsoft.com/office/word/2024/wordml/sdtformatlock" xmlns:w16se="http://schemas.microsoft.com/office/word/2015/wordml/symex" xmlns:wpg="http://schemas.microsoft.com/office/word/2010/wordprocessingGroup" xmlns:wpi="http://schemas.microsoft.com/office/word/2010/wordprocessingInk" xmlns:wne="http://schemas.microsoft.com/office/word/2006/wordml" xmlns:wps="http://schemas.microsoft.com/office/word/2010/wordprocessingShape" mc:Ignorable="w14 w15 w16se w16cid w16 w16cex w16sdtdh w16sdtfl w16du wp14">
   <w:p>
     <w:pPr>
@@ -895,6 +1096,16 @@
 </file>
 
 <file path=word/header1.xml><?xml version="1.0" encoding="utf-8"?>
+<w:hdr xmlns:wpc="http://schemas.microsoft.com/office/word/2010/wordprocessingCanvas" xmlns:cx="http://schemas.microsoft.com/office/drawing/2014/chartex" xmlns:cx1="http://schemas.microsoft.com/office/drawing/2015/9/8/chartex" xmlns:cx2="http://schemas.microsoft.com/office/drawing/2015/10/21/chartex" xmlns:cx3="http://schemas.microsoft.com/office/drawing/2016/5/9/chartex" xmlns:cx4="http://schemas.microsoft.com/office/drawing/2016/5/10/chartex" xmlns:cx5="http://schemas.microsoft.com/office/drawing/2016/5/11/chartex" xmlns:cx6="http://schemas.microsoft.com/office/drawing/2016/5/12/chartex" xmlns:cx7="http://schemas.microsoft.com/office/drawing/2016/5/13/chartex" xmlns:cx8="http://schemas.microsoft.com/office/drawing/2016/5/14/chartex" xmlns:mc="http://schemas.openxmlformats.org/markup-compatibility/2006" xmlns:aink="http://schemas.microsoft.com/office/drawing/2016/ink" xmlns:am3d="http://schemas.microsoft.com/office/drawing/2017/model3d" xmlns:o="urn:schemas-microsoft-com:office:office" xmlns:oel="http://schemas.microsoft.com/office/2019/extlst" xmlns:r="http://schemas.openxmlformats.org/officeDocument/2006/relationships" xmlns:m="http://schemas.openxmlformats.org/officeDocument/2006/math" xmlns:v="urn:schemas-microsoft-com:vml" xmlns:wp14="http://schemas.microsoft.com/office/word/2010/wordprocessingDrawing" xmlns:wp="http://schemas.openxmlformats.org/drawingml/2006/wordprocessingDrawing" xmlns:w10="urn:schemas-microsoft-com:office:word" xmlns:w="http://schemas.openxmlformats.org/wordprocessingml/2006/main" xmlns:w14="http://schemas.microsoft.com/office/word/2010/wordml" xmlns:w15="http://schemas.microsoft.com/office/word/2012/wordml" xmlns:w16cex="http://schemas.microsoft.com/office/word/2018/wordml/cex" xmlns:w16cid="http://schemas.microsoft.com/office/word/2016/wordml/cid" xmlns:w16="http://schemas.microsoft.com/office/word/2018/wordml" xmlns:w16du="http://schemas.microsoft.com/office/word/2023/wordml/word16du" xmlns:w16sdtdh="http://schemas.microsoft.com/office/word/2020/wordml/sdtdatahash" xmlns:w16sdtfl="http://schemas.microsoft.com/office/word/2024/wordml/sdtformatlock" xmlns:w16se="http://schemas.microsoft.com/office/word/2015/wordml/symex" xmlns:wpg="http://schemas.microsoft.com/office/word/2010/wordprocessingGroup" xmlns:wpi="http://schemas.microsoft.com/office/word/2010/wordprocessingInk" xmlns:wne="http://schemas.microsoft.com/office/word/2006/wordml" xmlns:wps="http://schemas.microsoft.com/office/word/2010/wordprocessingShape" mc:Ignorable="w14 w15 w16se w16cid w16 w16cex w16sdtdh w16sdtfl w16du wp14">
+  <w:p>
+    <w:pPr>
+      <w:pStyle w:val="a4"/>
+    </w:pPr>
+  </w:p>
+</w:hdr>
+</file>
+
+<file path=word/header2.xml><?xml version="1.0" encoding="utf-8"?>
 <w:hdr xmlns:wpc="http://schemas.microsoft.com/office/word/2010/wordprocessingCanvas" xmlns:cx="http://schemas.microsoft.com/office/drawing/2014/chartex" xmlns:cx1="http://schemas.microsoft.com/office/drawing/2015/9/8/chartex" xmlns:cx2="http://schemas.microsoft.com/office/drawing/2015/10/21/chartex" xmlns:cx3="http://schemas.microsoft.com/office/drawing/2016/5/9/chartex" xmlns:cx4="http://schemas.microsoft.com/office/drawing/2016/5/10/chartex" xmlns:cx5="http://schemas.microsoft.com/office/drawing/2016/5/11/chartex" xmlns:cx6="http://schemas.microsoft.com/office/drawing/2016/5/12/chartex" xmlns:cx7="http://schemas.microsoft.com/office/drawing/2016/5/13/chartex" xmlns:cx8="http://schemas.microsoft.com/office/drawing/2016/5/14/chartex" xmlns:mc="http://schemas.openxmlformats.org/markup-compatibility/2006" xmlns:aink="http://schemas.microsoft.com/office/drawing/2016/ink" xmlns:am3d="http://schemas.microsoft.com/office/drawing/2017/model3d" xmlns:o="urn:schemas-microsoft-com:office:office" xmlns:oel="http://schemas.microsoft.com/office/2019/extlst" xmlns:r="http://schemas.openxmlformats.org/officeDocument/2006/relationships" xmlns:m="http://schemas.openxmlformats.org/officeDocument/2006/math" xmlns:v="urn:schemas-microsoft-com:vml" xmlns:wp14="http://schemas.microsoft.com/office/word/2010/wordprocessingDrawing" xmlns:wp="http://schemas.openxmlformats.org/drawingml/2006/wordprocessingDrawing" xmlns:w10="urn:schemas-microsoft-com:office:word" xmlns:w="http://schemas.openxmlformats.org/wordprocessingml/2006/main" xmlns:w14="http://schemas.microsoft.com/office/word/2010/wordml" xmlns:w15="http://schemas.microsoft.com/office/word/2012/wordml" xmlns:w16cex="http://schemas.microsoft.com/office/word/2018/wordml/cex" xmlns:w16cid="http://schemas.microsoft.com/office/word/2016/wordml/cid" xmlns:w16="http://schemas.microsoft.com/office/word/2018/wordml" xmlns:w16du="http://schemas.microsoft.com/office/word/2023/wordml/word16du" xmlns:w16sdtdh="http://schemas.microsoft.com/office/word/2020/wordml/sdtdatahash" xmlns:w16sdtfl="http://schemas.microsoft.com/office/word/2024/wordml/sdtformatlock" xmlns:w16se="http://schemas.microsoft.com/office/word/2015/wordml/symex" xmlns:wpg="http://schemas.microsoft.com/office/word/2010/wordprocessingGroup" xmlns:wpi="http://schemas.microsoft.com/office/word/2010/wordprocessingInk" xmlns:wne="http://schemas.microsoft.com/office/word/2006/wordml" xmlns:wps="http://schemas.microsoft.com/office/word/2010/wordprocessingShape" mc:Ignorable="w14 w15 w16se w16cid w16 w16cex w16sdtdh w16sdtfl w16du wp14">
   <w:p>
     <w:pPr>
@@ -921,7 +1132,7 @@
 </w:hdr>
 </file>
 
-<file path=word/header2.xml><?xml version="1.0" encoding="utf-8"?>
+<file path=word/header3.xml><?xml version="1.0" encoding="utf-8"?>
 <w:hdr xmlns:wpc="http://schemas.microsoft.com/office/word/2010/wordprocessingCanvas" xmlns:cx="http://schemas.microsoft.com/office/drawing/2014/chartex" xmlns:cx1="http://schemas.microsoft.com/office/drawing/2015/9/8/chartex" xmlns:cx2="http://schemas.microsoft.com/office/drawing/2015/10/21/chartex" xmlns:cx3="http://schemas.microsoft.com/office/drawing/2016/5/9/chartex" xmlns:cx4="http://schemas.microsoft.com/office/drawing/2016/5/10/chartex" xmlns:cx5="http://schemas.microsoft.com/office/drawing/2016/5/11/chartex" xmlns:cx6="http://schemas.microsoft.com/office/drawing/2016/5/12/chartex" xmlns:cx7="http://schemas.microsoft.com/office/drawing/2016/5/13/chartex" xmlns:cx8="http://schemas.microsoft.com/office/drawing/2016/5/14/chartex" xmlns:mc="http://schemas.openxmlformats.org/markup-compatibility/2006" xmlns:aink="http://schemas.microsoft.com/office/drawing/2016/ink" xmlns:am3d="http://schemas.microsoft.com/office/drawing/2017/model3d" xmlns:o="urn:schemas-microsoft-com:office:office" xmlns:oel="http://schemas.microsoft.com/office/2019/extlst" xmlns:r="http://schemas.openxmlformats.org/officeDocument/2006/relationships" xmlns:m="http://schemas.openxmlformats.org/officeDocument/2006/math" xmlns:v="urn:schemas-microsoft-com:vml" xmlns:wp14="http://schemas.microsoft.com/office/word/2010/wordprocessingDrawing" xmlns:wp="http://schemas.openxmlformats.org/drawingml/2006/wordprocessingDrawing" xmlns:w10="urn:schemas-microsoft-com:office:word" xmlns:w="http://schemas.openxmlformats.org/wordprocessingml/2006/main" xmlns:w14="http://schemas.microsoft.com/office/word/2010/wordml" xmlns:w15="http://schemas.microsoft.com/office/word/2012/wordml" xmlns:w16cex="http://schemas.microsoft.com/office/word/2018/wordml/cex" xmlns:w16cid="http://schemas.microsoft.com/office/word/2016/wordml/cid" xmlns:w16="http://schemas.microsoft.com/office/word/2018/wordml" xmlns:w16du="http://schemas.microsoft.com/office/word/2023/wordml/word16du" xmlns:w16sdtdh="http://schemas.microsoft.com/office/word/2020/wordml/sdtdatahash" xmlns:w16sdtfl="http://schemas.microsoft.com/office/word/2024/wordml/sdtformatlock" xmlns:w16se="http://schemas.microsoft.com/office/word/2015/wordml/symex" xmlns:wpg="http://schemas.microsoft.com/office/word/2010/wordprocessingGroup" xmlns:wpi="http://schemas.microsoft.com/office/word/2010/wordprocessingInk" xmlns:wne="http://schemas.microsoft.com/office/word/2006/wordml" xmlns:wps="http://schemas.microsoft.com/office/word/2010/wordprocessingShape" mc:Ignorable="w14 w15 w16se w16cid w16 w16cex w16sdtdh w16sdtfl w16du wp14">
   <w:p>
     <w:pPr>

</xml_diff>

<commit_message>
Made some changes to the temp_prediction function: made the temp prediction not so flexible and more stable by taking averages. Added calling function in main script Some changes that IDK in work template
</commit_message>
<xml_diff>
--- a/MATLAB Coursework 2  Word Template.docx
+++ b/MATLAB Coursework 2  Word Template.docx
@@ -860,13 +860,145 @@
         </w:drawing>
       </w:r>
     </w:p>
+    <w:p>
+      <w:pPr>
+        <w:spacing w:line="259" w:lineRule="auto"/>
+        <w:jc w:val="both"/>
+        <w:rPr>
+          <w:color w:val="000000" w:themeColor="text1"/>
+          <w:highlight w:val="cyan"/>
+          <w:lang w:val="en-US" w:eastAsia="zh-CN"/>
+        </w:rPr>
+      </w:pPr>
+      <w:r>
+        <w:rPr>
+          <w:color w:val="000000" w:themeColor="text1"/>
+          <w:highlight w:val="cyan"/>
+          <w:lang w:val="en-US" w:eastAsia="zh-CN"/>
+        </w:rPr>
+        <w:lastRenderedPageBreak/>
+        <w:t>TASK 3: Temperature prediction</w:t>
+      </w:r>
+    </w:p>
+    <w:p>
+      <w:pPr>
+        <w:pStyle w:val="a0"/>
+        <w:numPr>
+          <w:ilvl w:val="0"/>
+          <w:numId w:val="7"/>
+        </w:numPr>
+        <w:spacing w:line="259" w:lineRule="auto"/>
+        <w:jc w:val="both"/>
+        <w:rPr>
+          <w:color w:val="000000" w:themeColor="text1"/>
+          <w:highlight w:val="cyan"/>
+          <w:lang w:val="en-US" w:eastAsia="zh-CN"/>
+        </w:rPr>
+      </w:pPr>
+      <w:r>
+        <w:rPr>
+          <w:color w:val="000000" w:themeColor="text1"/>
+          <w:highlight w:val="cyan"/>
+          <w:lang w:val="en-US" w:eastAsia="zh-CN"/>
+        </w:rPr>
+        <w:t xml:space="preserve">Flowchart before </w:t>
+      </w:r>
+      <w:proofErr w:type="gramStart"/>
+      <w:r>
+        <w:rPr>
+          <w:color w:val="000000" w:themeColor="text1"/>
+          <w:highlight w:val="cyan"/>
+          <w:lang w:val="en-US" w:eastAsia="zh-CN"/>
+        </w:rPr>
+        <w:t>start</w:t>
+      </w:r>
+      <w:proofErr w:type="gramEnd"/>
+    </w:p>
+    <w:p>
+      <w:pPr>
+        <w:pStyle w:val="a0"/>
+        <w:spacing w:line="259" w:lineRule="auto"/>
+        <w:ind w:left="440"/>
+        <w:jc w:val="both"/>
+        <w:rPr>
+          <w:color w:val="000000" w:themeColor="text1"/>
+          <w:highlight w:val="cyan"/>
+          <w:lang w:val="en-US" w:eastAsia="zh-CN"/>
+        </w:rPr>
+      </w:pPr>
+      <w:r>
+        <w:rPr>
+          <w:rFonts w:hint="eastAsia"/>
+          <w:noProof/>
+          <w:color w:val="000000" w:themeColor="text1"/>
+          <w:lang w:val="en-US" w:eastAsia="zh-CN"/>
+        </w:rPr>
+        <w:drawing>
+          <wp:inline distT="0" distB="0" distL="0" distR="0" wp14:anchorId="1E4D47FD" wp14:editId="19307238">
+            <wp:extent cx="4569460" cy="8377238"/>
+            <wp:effectExtent l="0" t="0" r="2540" b="5080"/>
+            <wp:docPr id="956018023" name="图片 3"/>
+            <wp:cNvGraphicFramePr>
+              <a:graphicFrameLocks xmlns:a="http://schemas.openxmlformats.org/drawingml/2006/main" noChangeAspect="1"/>
+            </wp:cNvGraphicFramePr>
+            <a:graphic xmlns:a="http://schemas.openxmlformats.org/drawingml/2006/main">
+              <a:graphicData uri="http://schemas.openxmlformats.org/drawingml/2006/picture">
+                <pic:pic xmlns:pic="http://schemas.openxmlformats.org/drawingml/2006/picture">
+                  <pic:nvPicPr>
+                    <pic:cNvPr id="956018023" name="图片 956018023"/>
+                    <pic:cNvPicPr/>
+                  </pic:nvPicPr>
+                  <pic:blipFill>
+                    <a:blip r:embed="rId14">
+                      <a:extLst>
+                        <a:ext uri="{28A0092B-C50C-407E-A947-70E740481C1C}">
+                          <a14:useLocalDpi xmlns:a14="http://schemas.microsoft.com/office/drawing/2010/main" val="0"/>
+                        </a:ext>
+                      </a:extLst>
+                    </a:blip>
+                    <a:stretch>
+                      <a:fillRect/>
+                    </a:stretch>
+                  </pic:blipFill>
+                  <pic:spPr>
+                    <a:xfrm>
+                      <a:off x="0" y="0"/>
+                      <a:ext cx="4571736" cy="8381410"/>
+                    </a:xfrm>
+                    <a:prstGeom prst="rect">
+                      <a:avLst/>
+                    </a:prstGeom>
+                  </pic:spPr>
+                </pic:pic>
+              </a:graphicData>
+            </a:graphic>
+          </wp:inline>
+        </w:drawing>
+      </w:r>
+    </w:p>
+    <w:p>
+      <w:pPr>
+        <w:pStyle w:val="a0"/>
+        <w:numPr>
+          <w:ilvl w:val="0"/>
+          <w:numId w:val="7"/>
+        </w:numPr>
+        <w:spacing w:line="259" w:lineRule="auto"/>
+        <w:jc w:val="both"/>
+        <w:rPr>
+          <w:color w:val="000000" w:themeColor="text1"/>
+          <w:highlight w:val="cyan"/>
+          <w:lang w:val="en-US" w:eastAsia="zh-CN"/>
+        </w:rPr>
+      </w:pPr>
+    </w:p>
     <w:sectPr>
-      <w:headerReference w:type="even" r:id="rId14"/>
-      <w:headerReference w:type="default" r:id="rId15"/>
-      <w:footerReference w:type="even" r:id="rId16"/>
-      <w:footerReference w:type="default" r:id="rId17"/>
-      <w:headerReference w:type="first" r:id="rId18"/>
-      <w:footerReference w:type="first" r:id="rId19"/>
+      <w:headerReference w:type="even" r:id="rId15"/>
+      <w:headerReference w:type="default" r:id="rId16"/>
+      <w:footerReference w:type="even" r:id="rId17"/>
+      <w:footerReference w:type="default" r:id="rId18"/>
+      <w:headerReference w:type="first" r:id="rId19"/>
+      <w:footerReference w:type="first" r:id="rId20"/>
       <w:pgSz w:w="11906" w:h="16838"/>
       <w:pgMar w:top="1440" w:right="1440" w:bottom="1440" w:left="1440" w:header="850" w:footer="708" w:gutter="0"/>
       <w:cols w:space="708"/>
@@ -1494,6 +1626,92 @@
     </w:lvl>
   </w:abstractNum>
   <w:abstractNum w:abstractNumId="2" w15:restartNumberingAfterBreak="0">
+    <w:nsid w:val="32B17265"/>
+    <w:multiLevelType w:val="hybridMultilevel"/>
+    <w:tmpl w:val="A9162278"/>
+    <w:lvl w:ilvl="0" w:tplc="0409000F">
+      <w:start w:val="1"/>
+      <w:numFmt w:val="decimal"/>
+      <w:lvlText w:val="%1."/>
+      <w:lvlJc w:val="left"/>
+      <w:pPr>
+        <w:ind w:left="440" w:hanging="440"/>
+      </w:pPr>
+    </w:lvl>
+    <w:lvl w:ilvl="1" w:tplc="04090019" w:tentative="1">
+      <w:start w:val="1"/>
+      <w:numFmt w:val="lowerLetter"/>
+      <w:lvlText w:val="%2)"/>
+      <w:lvlJc w:val="left"/>
+      <w:pPr>
+        <w:ind w:left="880" w:hanging="440"/>
+      </w:pPr>
+    </w:lvl>
+    <w:lvl w:ilvl="2" w:tplc="0409001B" w:tentative="1">
+      <w:start w:val="1"/>
+      <w:numFmt w:val="lowerRoman"/>
+      <w:lvlText w:val="%3."/>
+      <w:lvlJc w:val="right"/>
+      <w:pPr>
+        <w:ind w:left="1320" w:hanging="440"/>
+      </w:pPr>
+    </w:lvl>
+    <w:lvl w:ilvl="3" w:tplc="0409000F" w:tentative="1">
+      <w:start w:val="1"/>
+      <w:numFmt w:val="decimal"/>
+      <w:lvlText w:val="%4."/>
+      <w:lvlJc w:val="left"/>
+      <w:pPr>
+        <w:ind w:left="1760" w:hanging="440"/>
+      </w:pPr>
+    </w:lvl>
+    <w:lvl w:ilvl="4" w:tplc="04090019" w:tentative="1">
+      <w:start w:val="1"/>
+      <w:numFmt w:val="lowerLetter"/>
+      <w:lvlText w:val="%5)"/>
+      <w:lvlJc w:val="left"/>
+      <w:pPr>
+        <w:ind w:left="2200" w:hanging="440"/>
+      </w:pPr>
+    </w:lvl>
+    <w:lvl w:ilvl="5" w:tplc="0409001B" w:tentative="1">
+      <w:start w:val="1"/>
+      <w:numFmt w:val="lowerRoman"/>
+      <w:lvlText w:val="%6."/>
+      <w:lvlJc w:val="right"/>
+      <w:pPr>
+        <w:ind w:left="2640" w:hanging="440"/>
+      </w:pPr>
+    </w:lvl>
+    <w:lvl w:ilvl="6" w:tplc="0409000F" w:tentative="1">
+      <w:start w:val="1"/>
+      <w:numFmt w:val="decimal"/>
+      <w:lvlText w:val="%7."/>
+      <w:lvlJc w:val="left"/>
+      <w:pPr>
+        <w:ind w:left="3080" w:hanging="440"/>
+      </w:pPr>
+    </w:lvl>
+    <w:lvl w:ilvl="7" w:tplc="04090019" w:tentative="1">
+      <w:start w:val="1"/>
+      <w:numFmt w:val="lowerLetter"/>
+      <w:lvlText w:val="%8)"/>
+      <w:lvlJc w:val="left"/>
+      <w:pPr>
+        <w:ind w:left="3520" w:hanging="440"/>
+      </w:pPr>
+    </w:lvl>
+    <w:lvl w:ilvl="8" w:tplc="0409001B" w:tentative="1">
+      <w:start w:val="1"/>
+      <w:numFmt w:val="lowerRoman"/>
+      <w:lvlText w:val="%9."/>
+      <w:lvlJc w:val="right"/>
+      <w:pPr>
+        <w:ind w:left="3960" w:hanging="440"/>
+      </w:pPr>
+    </w:lvl>
+  </w:abstractNum>
+  <w:abstractNum w:abstractNumId="3" w15:restartNumberingAfterBreak="0">
     <w:nsid w:val="49D82E44"/>
     <w:multiLevelType w:val="multilevel"/>
     <w:tmpl w:val="6B982794"/>
@@ -1581,7 +1799,7 @@
       </w:pPr>
     </w:lvl>
   </w:abstractNum>
-  <w:abstractNum w:abstractNumId="3" w15:restartNumberingAfterBreak="0">
+  <w:abstractNum w:abstractNumId="4" w15:restartNumberingAfterBreak="0">
     <w:nsid w:val="509A57DD"/>
     <w:multiLevelType w:val="hybridMultilevel"/>
     <w:tmpl w:val="25F4533C"/>
@@ -1694,7 +1912,7 @@
       </w:rPr>
     </w:lvl>
   </w:abstractNum>
-  <w:abstractNum w:abstractNumId="4" w15:restartNumberingAfterBreak="0">
+  <w:abstractNum w:abstractNumId="5" w15:restartNumberingAfterBreak="0">
     <w:nsid w:val="54237D38"/>
     <w:multiLevelType w:val="hybridMultilevel"/>
     <w:tmpl w:val="2828F10A"/>
@@ -1807,7 +2025,7 @@
       </w:rPr>
     </w:lvl>
   </w:abstractNum>
-  <w:abstractNum w:abstractNumId="5" w15:restartNumberingAfterBreak="0">
+  <w:abstractNum w:abstractNumId="6" w15:restartNumberingAfterBreak="0">
     <w:nsid w:val="596A136B"/>
     <w:multiLevelType w:val="hybridMultilevel"/>
     <w:tmpl w:val="E8A47C52"/>
@@ -1897,22 +2115,25 @@
     </w:lvl>
   </w:abstractNum>
   <w:num w:numId="1" w16cid:durableId="1827822957">
-    <w:abstractNumId w:val="2"/>
+    <w:abstractNumId w:val="3"/>
   </w:num>
   <w:num w:numId="2" w16cid:durableId="907231765">
     <w:abstractNumId w:val="0"/>
   </w:num>
   <w:num w:numId="3" w16cid:durableId="1932926543">
-    <w:abstractNumId w:val="3"/>
+    <w:abstractNumId w:val="4"/>
   </w:num>
   <w:num w:numId="4" w16cid:durableId="401878016">
-    <w:abstractNumId w:val="4"/>
+    <w:abstractNumId w:val="5"/>
   </w:num>
   <w:num w:numId="5" w16cid:durableId="1224950961">
-    <w:abstractNumId w:val="5"/>
+    <w:abstractNumId w:val="6"/>
   </w:num>
   <w:num w:numId="6" w16cid:durableId="1108813701">
     <w:abstractNumId w:val="1"/>
+  </w:num>
+  <w:num w:numId="7" w16cid:durableId="1697004198">
+    <w:abstractNumId w:val="2"/>
   </w:num>
 </w:numbering>
 </file>

</xml_diff>